<commit_message>
Inizio stesura Problem Statement
</commit_message>
<xml_diff>
--- a/Deliverables/ProblemStatement_MediBook.docx
+++ b/Deliverables/ProblemStatement_MediBook.docx
@@ -1,10 +1,10 @@
 
 <file path=word/document.xml><?xml version="1.0" encoding="utf-8"?>
-<w:document xmlns:wpc="http://schemas.microsoft.com/office/word/2010/wordprocessingCanvas" xmlns:cx="http://schemas.microsoft.com/office/drawing/2014/chartex" xmlns:cx1="http://schemas.microsoft.com/office/drawing/2015/9/8/chartex" xmlns:cx2="http://schemas.microsoft.com/office/drawing/2015/10/21/chartex" xmlns:cx3="http://schemas.microsoft.com/office/drawing/2016/5/9/chartex" xmlns:cx4="http://schemas.microsoft.com/office/drawing/2016/5/10/chartex" xmlns:cx5="http://schemas.microsoft.com/office/drawing/2016/5/11/chartex" xmlns:cx6="http://schemas.microsoft.com/office/drawing/2016/5/12/chartex" xmlns:cx7="http://schemas.microsoft.com/office/drawing/2016/5/13/chartex" xmlns:cx8="http://schemas.microsoft.com/office/drawing/2016/5/14/chartex" xmlns:mc="http://schemas.openxmlformats.org/markup-compatibility/2006" xmlns:aink="http://schemas.microsoft.com/office/drawing/2016/ink" xmlns:am3d="http://schemas.microsoft.com/office/drawing/2017/model3d" xmlns:o="urn:schemas-microsoft-com:office:office" xmlns:oel="http://schemas.microsoft.com/office/2019/extlst" xmlns:r="http://schemas.openxmlformats.org/officeDocument/2006/relationships" xmlns:m="http://schemas.openxmlformats.org/officeDocument/2006/math" xmlns:v="urn:schemas-microsoft-com:vml" xmlns:wp14="http://schemas.microsoft.com/office/word/2010/wordprocessingDrawing" xmlns:wp="http://schemas.openxmlformats.org/drawingml/2006/wordprocessingDrawing" xmlns:w10="urn:schemas-microsoft-com:office:word" xmlns:w="http://schemas.openxmlformats.org/wordprocessingml/2006/main" xmlns:w14="http://schemas.microsoft.com/office/word/2010/wordml" xmlns:w15="http://schemas.microsoft.com/office/word/2012/wordml" xmlns:w16cex="http://schemas.microsoft.com/office/word/2018/wordml/cex" xmlns:w16cid="http://schemas.microsoft.com/office/word/2016/wordml/cid" xmlns:w16="http://schemas.microsoft.com/office/word/2018/wordml" xmlns:w16sdtdh="http://schemas.microsoft.com/office/word/2020/wordml/sdtdatahash" xmlns:w16se="http://schemas.microsoft.com/office/word/2015/wordml/symex" xmlns:wpg="http://schemas.microsoft.com/office/word/2010/wordprocessingGroup" xmlns:wpi="http://schemas.microsoft.com/office/word/2010/wordprocessingInk" xmlns:wne="http://schemas.microsoft.com/office/word/2006/wordml" xmlns:wps="http://schemas.microsoft.com/office/word/2010/wordprocessingShape" mc:Ignorable="w14 w15 w16se w16cid w16 w16cex w16sdtdh wp14">
+<w:document xmlns:wpc="http://schemas.microsoft.com/office/word/2010/wordprocessingCanvas" xmlns:cx="http://schemas.microsoft.com/office/drawing/2014/chartex" xmlns:cx1="http://schemas.microsoft.com/office/drawing/2015/9/8/chartex" xmlns:cx2="http://schemas.microsoft.com/office/drawing/2015/10/21/chartex" xmlns:cx3="http://schemas.microsoft.com/office/drawing/2016/5/9/chartex" xmlns:cx4="http://schemas.microsoft.com/office/drawing/2016/5/10/chartex" xmlns:cx5="http://schemas.microsoft.com/office/drawing/2016/5/11/chartex" xmlns:cx6="http://schemas.microsoft.com/office/drawing/2016/5/12/chartex" xmlns:cx7="http://schemas.microsoft.com/office/drawing/2016/5/13/chartex" xmlns:cx8="http://schemas.microsoft.com/office/drawing/2016/5/14/chartex" xmlns:mc="http://schemas.openxmlformats.org/markup-compatibility/2006" xmlns:aink="http://schemas.microsoft.com/office/drawing/2016/ink" xmlns:am3d="http://schemas.microsoft.com/office/drawing/2017/model3d" xmlns:o="urn:schemas-microsoft-com:office:office" xmlns:oel="http://schemas.microsoft.com/office/2019/extlst" xmlns:r="http://schemas.openxmlformats.org/officeDocument/2006/relationships" xmlns:m="http://schemas.openxmlformats.org/officeDocument/2006/math" xmlns:v="urn:schemas-microsoft-com:vml" xmlns:wp14="http://schemas.microsoft.com/office/word/2010/wordprocessingDrawing" xmlns:wp="http://schemas.openxmlformats.org/drawingml/2006/wordprocessingDrawing" xmlns:w10="urn:schemas-microsoft-com:office:word" xmlns:w="http://schemas.openxmlformats.org/wordprocessingml/2006/main" xmlns:w14="http://schemas.microsoft.com/office/word/2010/wordml" xmlns:w15="http://schemas.microsoft.com/office/word/2012/wordml" xmlns:w16cex="http://schemas.microsoft.com/office/word/2018/wordml/cex" xmlns:w16cid="http://schemas.microsoft.com/office/word/2016/wordml/cid" xmlns:w16="http://schemas.microsoft.com/office/word/2018/wordml" xmlns:w16du="http://schemas.microsoft.com/office/word/2023/wordml/word16du" xmlns:w16sdtdh="http://schemas.microsoft.com/office/word/2020/wordml/sdtdatahash" xmlns:w16sdtfl="http://schemas.microsoft.com/office/word/2024/wordml/sdtformatlock" xmlns:w16se="http://schemas.microsoft.com/office/word/2015/wordml/symex" xmlns:wpg="http://schemas.microsoft.com/office/word/2010/wordprocessingGroup" xmlns:wpi="http://schemas.microsoft.com/office/word/2010/wordprocessingInk" xmlns:wne="http://schemas.microsoft.com/office/word/2006/wordml" xmlns:wps="http://schemas.microsoft.com/office/word/2010/wordprocessingShape" mc:Ignorable="w14 w15 w16se w16cid w16 w16cex w16sdtdh w16sdtfl w16du wp14">
   <w:body>
     <w:p>
       <w:pPr>
-        <w:pStyle w:val="Title"/>
+        <w:pStyle w:val="Titolo"/>
         <w:rPr>
           <w:rFonts w:ascii="Times New Roman" w:hAnsi="Times New Roman" w:cs="Times New Roman"/>
           <w:b/>
@@ -23,11 +23,12 @@
     <w:p/>
     <w:p>
       <w:pPr>
-        <w:pStyle w:val="Heading2"/>
+        <w:pStyle w:val="Titolo2"/>
         <w:rPr>
           <w:rFonts w:ascii="Times New Roman" w:hAnsi="Times New Roman" w:cs="Times New Roman"/>
           <w:b/>
           <w:bCs/>
+          <w:u w:val="single"/>
         </w:rPr>
       </w:pPr>
       <w:r>
@@ -164,7 +165,7 @@
     </w:p>
     <w:p>
       <w:pPr>
-        <w:pStyle w:val="Heading2"/>
+        <w:pStyle w:val="Titolo2"/>
         <w:rPr>
           <w:rFonts w:ascii="Times New Roman" w:hAnsi="Times New Roman" w:cs="Times New Roman"/>
           <w:b/>
@@ -220,7 +221,7 @@
     </w:p>
     <w:p>
       <w:pPr>
-        <w:pStyle w:val="ListParagraph"/>
+        <w:pStyle w:val="Paragrafoelenco"/>
         <w:numPr>
           <w:ilvl w:val="0"/>
           <w:numId w:val="2"/>
@@ -244,18 +245,18 @@
     </w:p>
     <w:p>
       <w:pPr>
-        <w:pStyle w:val="ListParagraph"/>
-        <w:rPr>
-          <w:rFonts w:ascii="Times New Roman" w:eastAsia="Times New Roman" w:hAnsi="Times New Roman" w:cs="Times New Roman"/>
-          <w:kern w:val="0"/>
-          <w:lang w:eastAsia="it-IT"/>
-          <w14:ligatures w14:val="none"/>
-        </w:rPr>
-      </w:pPr>
-    </w:p>
-    <w:p>
-      <w:pPr>
-        <w:pStyle w:val="ListParagraph"/>
+        <w:pStyle w:val="Paragrafoelenco"/>
+        <w:rPr>
+          <w:rFonts w:ascii="Times New Roman" w:eastAsia="Times New Roman" w:hAnsi="Times New Roman" w:cs="Times New Roman"/>
+          <w:kern w:val="0"/>
+          <w:lang w:eastAsia="it-IT"/>
+          <w14:ligatures w14:val="none"/>
+        </w:rPr>
+      </w:pPr>
+    </w:p>
+    <w:p>
+      <w:pPr>
+        <w:pStyle w:val="Paragrafoelenco"/>
         <w:numPr>
           <w:ilvl w:val="0"/>
           <w:numId w:val="2"/>
@@ -279,18 +280,18 @@
     </w:p>
     <w:p>
       <w:pPr>
-        <w:pStyle w:val="ListParagraph"/>
-        <w:rPr>
-          <w:rFonts w:ascii="Times New Roman" w:eastAsia="Times New Roman" w:hAnsi="Times New Roman" w:cs="Times New Roman"/>
-          <w:kern w:val="0"/>
-          <w:lang w:eastAsia="it-IT"/>
-          <w14:ligatures w14:val="none"/>
-        </w:rPr>
-      </w:pPr>
-    </w:p>
-    <w:p>
-      <w:pPr>
-        <w:pStyle w:val="ListParagraph"/>
+        <w:pStyle w:val="Paragrafoelenco"/>
+        <w:rPr>
+          <w:rFonts w:ascii="Times New Roman" w:eastAsia="Times New Roman" w:hAnsi="Times New Roman" w:cs="Times New Roman"/>
+          <w:kern w:val="0"/>
+          <w:lang w:eastAsia="it-IT"/>
+          <w14:ligatures w14:val="none"/>
+        </w:rPr>
+      </w:pPr>
+    </w:p>
+    <w:p>
+      <w:pPr>
+        <w:pStyle w:val="Paragrafoelenco"/>
         <w:numPr>
           <w:ilvl w:val="0"/>
           <w:numId w:val="2"/>
@@ -314,7 +315,7 @@
     </w:p>
     <w:p>
       <w:pPr>
-        <w:pStyle w:val="ListParagraph"/>
+        <w:pStyle w:val="Paragrafoelenco"/>
         <w:numPr>
           <w:ilvl w:val="1"/>
           <w:numId w:val="2"/>
@@ -338,7 +339,7 @@
     </w:p>
     <w:p>
       <w:pPr>
-        <w:pStyle w:val="ListParagraph"/>
+        <w:pStyle w:val="Paragrafoelenco"/>
         <w:numPr>
           <w:ilvl w:val="1"/>
           <w:numId w:val="2"/>
@@ -362,7 +363,7 @@
     </w:p>
     <w:p>
       <w:pPr>
-        <w:pStyle w:val="ListParagraph"/>
+        <w:pStyle w:val="Paragrafoelenco"/>
         <w:numPr>
           <w:ilvl w:val="1"/>
           <w:numId w:val="2"/>
@@ -382,6 +383,1575 @@
           <w14:ligatures w14:val="none"/>
         </w:rPr>
         <w:t>Medici, che potranno approvare appuntamenti, registrare visite e rilasciare referti</w:t>
+      </w:r>
+    </w:p>
+    <w:p>
+      <w:pPr>
+        <w:rPr>
+          <w:rFonts w:ascii="Times New Roman" w:eastAsia="Times New Roman" w:hAnsi="Times New Roman" w:cs="Times New Roman"/>
+          <w:kern w:val="0"/>
+          <w:lang w:eastAsia="it-IT"/>
+          <w14:ligatures w14:val="none"/>
+        </w:rPr>
+      </w:pPr>
+    </w:p>
+    <w:p>
+      <w:pPr>
+        <w:pStyle w:val="Titolo2"/>
+        <w:rPr>
+          <w:rFonts w:ascii="Times New Roman" w:hAnsi="Times New Roman" w:cs="Times New Roman"/>
+          <w:b/>
+          <w:bCs/>
+        </w:rPr>
+      </w:pPr>
+      <w:r>
+        <w:rPr>
+          <w:rFonts w:ascii="Times New Roman" w:hAnsi="Times New Roman" w:cs="Times New Roman"/>
+          <w:b/>
+          <w:bCs/>
+        </w:rPr>
+        <w:t>Problem Domain</w:t>
+      </w:r>
+    </w:p>
+    <w:p>
+      <w:pPr>
+        <w:rPr>
+          <w:rFonts w:ascii="Times New Roman" w:eastAsia="Times New Roman" w:hAnsi="Times New Roman" w:cs="Times New Roman"/>
+          <w:kern w:val="0"/>
+          <w:lang w:eastAsia="it-IT"/>
+          <w14:ligatures w14:val="none"/>
+        </w:rPr>
+      </w:pPr>
+      <w:r>
+        <w:rPr>
+          <w:rFonts w:ascii="Times New Roman" w:eastAsia="Times New Roman" w:hAnsi="Times New Roman" w:cs="Times New Roman"/>
+          <w:kern w:val="0"/>
+          <w:lang w:eastAsia="it-IT"/>
+          <w14:ligatures w14:val="none"/>
+        </w:rPr>
+        <w:t>Il dominio del problema riguarda la gestione inefficiente delle prenotazioni mediche presso studi e cliniche. Attualmente, le prenotazioni vengono effettuate principalmente tramite telefono o di persona, causando lunghi tempi di attesa, sovraccarico del personale amministrativo e mancanza di visibilità sulle disponibilità dei medici. Questa inefficienza comporta errori, disdette non registrate e difficoltà di comunicazione tra pazienti, segreteria e medici. MediBook intende risolvere queste criticità digitalizzando e automatizzando il processo di prenotazione.</w:t>
+      </w:r>
+    </w:p>
+    <w:p>
+      <w:pPr>
+        <w:pStyle w:val="Titolo2"/>
+        <w:rPr>
+          <w:rFonts w:ascii="Times New Roman" w:hAnsi="Times New Roman" w:cs="Times New Roman"/>
+          <w:b/>
+          <w:bCs/>
+        </w:rPr>
+      </w:pPr>
+      <w:r>
+        <w:rPr>
+          <w:rFonts w:ascii="Times New Roman" w:hAnsi="Times New Roman" w:cs="Times New Roman"/>
+          <w:b/>
+          <w:bCs/>
+        </w:rPr>
+        <w:t>Scenario</w:t>
+      </w:r>
+    </w:p>
+    <w:p>
+      <w:pPr>
+        <w:pStyle w:val="Titolo4"/>
+        <w:rPr>
+          <w:b/>
+          <w:bCs/>
+          <w:color w:val="000000" w:themeColor="text1"/>
+        </w:rPr>
+      </w:pPr>
+      <w:r>
+        <w:rPr>
+          <w:b/>
+          <w:bCs/>
+          <w:color w:val="000000" w:themeColor="text1"/>
+        </w:rPr>
+        <w:t>Scenario Prenotazione visita da parte del paziente</w:t>
+      </w:r>
+    </w:p>
+    <w:p>
+      <w:pPr>
+        <w:rPr>
+          <w:rFonts w:ascii="Times New Roman" w:eastAsia="Times New Roman" w:hAnsi="Times New Roman" w:cs="Times New Roman"/>
+          <w:kern w:val="0"/>
+          <w:lang w:eastAsia="it-IT"/>
+          <w14:ligatures w14:val="none"/>
+        </w:rPr>
+      </w:pPr>
+      <w:r>
+        <w:rPr>
+          <w:rFonts w:ascii="Times New Roman" w:eastAsia="Times New Roman" w:hAnsi="Times New Roman" w:cs="Times New Roman"/>
+          <w:kern w:val="0"/>
+          <w:lang w:eastAsia="it-IT"/>
+          <w14:ligatures w14:val="none"/>
+        </w:rPr>
+        <w:t>Il paziente Mario Rossi desidera prenotare una visita medica</w:t>
+      </w:r>
+      <w:r>
+        <w:rPr>
+          <w:rFonts w:ascii="Times New Roman" w:eastAsia="Times New Roman" w:hAnsi="Times New Roman" w:cs="Times New Roman"/>
+          <w:kern w:val="0"/>
+          <w:lang w:eastAsia="it-IT"/>
+          <w14:ligatures w14:val="none"/>
+        </w:rPr>
+        <w:t xml:space="preserve"> in seguito ad </w:t>
+      </w:r>
+      <w:r>
+        <w:rPr>
+          <w:rFonts w:ascii="Times New Roman" w:eastAsia="Times New Roman" w:hAnsi="Times New Roman" w:cs="Times New Roman"/>
+          <w:kern w:val="0"/>
+          <w:lang w:eastAsia="it-IT"/>
+          <w14:ligatures w14:val="none"/>
+        </w:rPr>
+        <w:t>un problema</w:t>
+      </w:r>
+      <w:r>
+        <w:rPr>
+          <w:rFonts w:ascii="Times New Roman" w:eastAsia="Times New Roman" w:hAnsi="Times New Roman" w:cs="Times New Roman"/>
+          <w:kern w:val="0"/>
+          <w:lang w:eastAsia="it-IT"/>
+          <w14:ligatures w14:val="none"/>
+        </w:rPr>
+        <w:t xml:space="preserve"> di salute riscontrato</w:t>
+      </w:r>
+      <w:r>
+        <w:rPr>
+          <w:rFonts w:ascii="Times New Roman" w:eastAsia="Times New Roman" w:hAnsi="Times New Roman" w:cs="Times New Roman"/>
+          <w:kern w:val="0"/>
+          <w:lang w:eastAsia="it-IT"/>
+          <w14:ligatures w14:val="none"/>
+        </w:rPr>
+        <w:t>.</w:t>
+      </w:r>
+    </w:p>
+    <w:p>
+      <w:pPr>
+        <w:rPr>
+          <w:rFonts w:ascii="Times New Roman" w:eastAsia="Times New Roman" w:hAnsi="Times New Roman" w:cs="Times New Roman"/>
+          <w:kern w:val="0"/>
+          <w:lang w:eastAsia="it-IT"/>
+          <w14:ligatures w14:val="none"/>
+        </w:rPr>
+      </w:pPr>
+      <w:r>
+        <w:rPr>
+          <w:rFonts w:ascii="Times New Roman" w:eastAsia="Times New Roman" w:hAnsi="Times New Roman" w:cs="Times New Roman"/>
+          <w:kern w:val="0"/>
+          <w:highlight w:val="yellow"/>
+          <w:lang w:eastAsia="it-IT"/>
+          <w14:ligatures w14:val="none"/>
+        </w:rPr>
+        <w:t>Il paziente accede al sistema MediBook tramite browser e</w:t>
+      </w:r>
+      <w:r>
+        <w:rPr>
+          <w:rFonts w:ascii="Times New Roman" w:eastAsia="Times New Roman" w:hAnsi="Times New Roman" w:cs="Times New Roman"/>
+          <w:kern w:val="0"/>
+          <w:highlight w:val="yellow"/>
+          <w:lang w:eastAsia="it-IT"/>
+          <w14:ligatures w14:val="none"/>
+        </w:rPr>
+        <w:t xml:space="preserve"> si autentica i</w:t>
+      </w:r>
+      <w:r>
+        <w:rPr>
+          <w:rFonts w:ascii="Times New Roman" w:eastAsia="Times New Roman" w:hAnsi="Times New Roman" w:cs="Times New Roman"/>
+          <w:kern w:val="0"/>
+          <w:highlight w:val="yellow"/>
+          <w:lang w:eastAsia="it-IT"/>
+          <w14:ligatures w14:val="none"/>
+        </w:rPr>
+        <w:t>nser</w:t>
+      </w:r>
+      <w:r>
+        <w:rPr>
+          <w:rFonts w:ascii="Times New Roman" w:eastAsia="Times New Roman" w:hAnsi="Times New Roman" w:cs="Times New Roman"/>
+          <w:kern w:val="0"/>
+          <w:highlight w:val="yellow"/>
+          <w:lang w:eastAsia="it-IT"/>
+          <w14:ligatures w14:val="none"/>
+        </w:rPr>
+        <w:t>endo</w:t>
+      </w:r>
+      <w:r>
+        <w:rPr>
+          <w:rFonts w:ascii="Times New Roman" w:eastAsia="Times New Roman" w:hAnsi="Times New Roman" w:cs="Times New Roman"/>
+          <w:kern w:val="0"/>
+          <w:highlight w:val="yellow"/>
+          <w:lang w:eastAsia="it-IT"/>
+          <w14:ligatures w14:val="none"/>
+        </w:rPr>
+        <w:t xml:space="preserve"> le proprie credenziali: username m.rossi@mail.com e password Medi123!</w:t>
+      </w:r>
+      <w:r>
+        <w:rPr>
+          <w:rFonts w:ascii="Times New Roman" w:eastAsia="Times New Roman" w:hAnsi="Times New Roman" w:cs="Times New Roman"/>
+          <w:kern w:val="0"/>
+          <w:highlight w:val="yellow"/>
+          <w:lang w:eastAsia="it-IT"/>
+          <w14:ligatures w14:val="none"/>
+        </w:rPr>
+        <w:t xml:space="preserve"> e accede alla home page personale del sito</w:t>
+      </w:r>
+      <w:r>
+        <w:rPr>
+          <w:rFonts w:ascii="Times New Roman" w:eastAsia="Times New Roman" w:hAnsi="Times New Roman" w:cs="Times New Roman"/>
+          <w:kern w:val="0"/>
+          <w:highlight w:val="yellow"/>
+          <w:lang w:eastAsia="it-IT"/>
+          <w14:ligatures w14:val="none"/>
+        </w:rPr>
+        <w:t>.</w:t>
+      </w:r>
+    </w:p>
+    <w:p>
+      <w:pPr>
+        <w:rPr>
+          <w:rFonts w:ascii="Times New Roman" w:eastAsia="Times New Roman" w:hAnsi="Times New Roman" w:cs="Times New Roman"/>
+          <w:kern w:val="0"/>
+          <w:lang w:eastAsia="it-IT"/>
+          <w14:ligatures w14:val="none"/>
+        </w:rPr>
+      </w:pPr>
+      <w:r>
+        <w:rPr>
+          <w:rFonts w:ascii="Times New Roman" w:eastAsia="Times New Roman" w:hAnsi="Times New Roman" w:cs="Times New Roman"/>
+          <w:kern w:val="0"/>
+          <w:lang w:eastAsia="it-IT"/>
+          <w14:ligatures w14:val="none"/>
+        </w:rPr>
+        <w:t>Mario seleziona la sezione Prenota Visita, dove viene mostrato l’elenco delle specializzazioni disponibili (cardiologia, dermatologia, ortopedia, ecc.).</w:t>
+      </w:r>
+    </w:p>
+    <w:p>
+      <w:pPr>
+        <w:rPr>
+          <w:rFonts w:ascii="Times New Roman" w:eastAsia="Times New Roman" w:hAnsi="Times New Roman" w:cs="Times New Roman"/>
+          <w:kern w:val="0"/>
+          <w:lang w:eastAsia="it-IT"/>
+          <w14:ligatures w14:val="none"/>
+        </w:rPr>
+      </w:pPr>
+      <w:r>
+        <w:rPr>
+          <w:rFonts w:ascii="Times New Roman" w:eastAsia="Times New Roman" w:hAnsi="Times New Roman" w:cs="Times New Roman"/>
+          <w:kern w:val="0"/>
+          <w:lang w:eastAsia="it-IT"/>
+          <w14:ligatures w14:val="none"/>
+        </w:rPr>
+        <w:t>Il paziente sceglie Cardiologia e visualizza l’elenco dei medici disponibili, insieme alle loro fasce orarie.</w:t>
+      </w:r>
+    </w:p>
+    <w:p>
+      <w:pPr>
+        <w:rPr>
+          <w:rFonts w:ascii="Times New Roman" w:eastAsia="Times New Roman" w:hAnsi="Times New Roman" w:cs="Times New Roman"/>
+          <w:kern w:val="0"/>
+          <w:lang w:eastAsia="it-IT"/>
+          <w14:ligatures w14:val="none"/>
+        </w:rPr>
+      </w:pPr>
+      <w:r>
+        <w:rPr>
+          <w:rFonts w:ascii="Times New Roman" w:eastAsia="Times New Roman" w:hAnsi="Times New Roman" w:cs="Times New Roman"/>
+          <w:kern w:val="0"/>
+          <w:lang w:eastAsia="it-IT"/>
+          <w14:ligatures w14:val="none"/>
+        </w:rPr>
+        <w:t>Mario seleziona il dott. Giovanni Bianchi, che riceve visite il martedì e giovedì pomeriggio.</w:t>
+      </w:r>
+    </w:p>
+    <w:p>
+      <w:pPr>
+        <w:rPr>
+          <w:rFonts w:ascii="Times New Roman" w:eastAsia="Times New Roman" w:hAnsi="Times New Roman" w:cs="Times New Roman"/>
+          <w:kern w:val="0"/>
+          <w:lang w:eastAsia="it-IT"/>
+          <w14:ligatures w14:val="none"/>
+        </w:rPr>
+      </w:pPr>
+      <w:r>
+        <w:rPr>
+          <w:rFonts w:ascii="Times New Roman" w:eastAsia="Times New Roman" w:hAnsi="Times New Roman" w:cs="Times New Roman"/>
+          <w:kern w:val="0"/>
+          <w:lang w:eastAsia="it-IT"/>
+          <w14:ligatures w14:val="none"/>
+        </w:rPr>
+        <w:t>Il sistema mostra un calendario con le disponibilità aggiornate.</w:t>
+      </w:r>
+    </w:p>
+    <w:p>
+      <w:pPr>
+        <w:rPr>
+          <w:rFonts w:ascii="Times New Roman" w:eastAsia="Times New Roman" w:hAnsi="Times New Roman" w:cs="Times New Roman"/>
+          <w:kern w:val="0"/>
+          <w:lang w:eastAsia="it-IT"/>
+          <w14:ligatures w14:val="none"/>
+        </w:rPr>
+      </w:pPr>
+      <w:r>
+        <w:rPr>
+          <w:rFonts w:ascii="Times New Roman" w:eastAsia="Times New Roman" w:hAnsi="Times New Roman" w:cs="Times New Roman"/>
+          <w:kern w:val="0"/>
+          <w:lang w:eastAsia="it-IT"/>
+          <w14:ligatures w14:val="none"/>
+        </w:rPr>
+        <w:t>Mario seleziona la data 15/11/2025 ore 15:30, e clicca su Conferma Prenotazione.</w:t>
+      </w:r>
+    </w:p>
+    <w:p>
+      <w:pPr>
+        <w:rPr>
+          <w:rFonts w:ascii="Times New Roman" w:eastAsia="Times New Roman" w:hAnsi="Times New Roman" w:cs="Times New Roman"/>
+          <w:kern w:val="0"/>
+          <w:lang w:eastAsia="it-IT"/>
+          <w14:ligatures w14:val="none"/>
+        </w:rPr>
+      </w:pPr>
+      <w:r>
+        <w:rPr>
+          <w:rFonts w:ascii="Times New Roman" w:eastAsia="Times New Roman" w:hAnsi="Times New Roman" w:cs="Times New Roman"/>
+          <w:kern w:val="0"/>
+          <w:lang w:eastAsia="it-IT"/>
+          <w14:ligatures w14:val="none"/>
+        </w:rPr>
+        <w:t>Il sistema richiede conferma e mostra il riepilogo: medico, data, ora e tipo di visita.</w:t>
+      </w:r>
+    </w:p>
+    <w:p>
+      <w:pPr>
+        <w:rPr>
+          <w:rFonts w:ascii="Times New Roman" w:eastAsia="Times New Roman" w:hAnsi="Times New Roman" w:cs="Times New Roman"/>
+          <w:kern w:val="0"/>
+          <w:lang w:eastAsia="it-IT"/>
+          <w14:ligatures w14:val="none"/>
+        </w:rPr>
+      </w:pPr>
+      <w:r>
+        <w:rPr>
+          <w:rFonts w:ascii="Times New Roman" w:eastAsia="Times New Roman" w:hAnsi="Times New Roman" w:cs="Times New Roman"/>
+          <w:kern w:val="0"/>
+          <w:lang w:eastAsia="it-IT"/>
+          <w14:ligatures w14:val="none"/>
+        </w:rPr>
+        <w:t>Il paziente conferma.</w:t>
+      </w:r>
+    </w:p>
+    <w:p>
+      <w:pPr>
+        <w:rPr>
+          <w:rFonts w:ascii="Times New Roman" w:eastAsia="Times New Roman" w:hAnsi="Times New Roman" w:cs="Times New Roman"/>
+          <w:kern w:val="0"/>
+          <w:lang w:eastAsia="it-IT"/>
+          <w14:ligatures w14:val="none"/>
+        </w:rPr>
+      </w:pPr>
+      <w:r>
+        <w:rPr>
+          <w:rFonts w:ascii="Times New Roman" w:eastAsia="Times New Roman" w:hAnsi="Times New Roman" w:cs="Times New Roman"/>
+          <w:kern w:val="0"/>
+          <w:lang w:eastAsia="it-IT"/>
+          <w14:ligatures w14:val="none"/>
+        </w:rPr>
+        <w:t>Il sistema registra la prenotazione nel database, invia una notifica e-mail di conferma all’indirizzo m.rossi@mail.com</w:t>
+      </w:r>
+      <w:r>
+        <w:rPr>
+          <w:rFonts w:ascii="Times New Roman" w:eastAsia="Times New Roman" w:hAnsi="Times New Roman" w:cs="Times New Roman"/>
+          <w:kern w:val="0"/>
+          <w:lang w:eastAsia="it-IT"/>
+          <w14:ligatures w14:val="none"/>
+        </w:rPr>
+        <w:t>.</w:t>
+      </w:r>
+    </w:p>
+    <w:p>
+      <w:pPr>
+        <w:rPr>
+          <w:rFonts w:ascii="Times New Roman" w:eastAsia="Times New Roman" w:hAnsi="Times New Roman" w:cs="Times New Roman"/>
+          <w:kern w:val="0"/>
+          <w:lang w:eastAsia="it-IT"/>
+          <w14:ligatures w14:val="none"/>
+        </w:rPr>
+      </w:pPr>
+      <w:r>
+        <w:rPr>
+          <w:rFonts w:ascii="Times New Roman" w:eastAsia="Times New Roman" w:hAnsi="Times New Roman" w:cs="Times New Roman"/>
+          <w:kern w:val="0"/>
+          <w:lang w:eastAsia="it-IT"/>
+          <w14:ligatures w14:val="none"/>
+        </w:rPr>
+        <w:t xml:space="preserve">Il paziente </w:t>
+      </w:r>
+      <w:r>
+        <w:rPr>
+          <w:rFonts w:ascii="Times New Roman" w:eastAsia="Times New Roman" w:hAnsi="Times New Roman" w:cs="Times New Roman"/>
+          <w:kern w:val="0"/>
+          <w:lang w:eastAsia="it-IT"/>
+          <w14:ligatures w14:val="none"/>
+        </w:rPr>
+        <w:t>può accedere</w:t>
+      </w:r>
+      <w:r>
+        <w:rPr>
+          <w:rFonts w:ascii="Times New Roman" w:eastAsia="Times New Roman" w:hAnsi="Times New Roman" w:cs="Times New Roman"/>
+          <w:kern w:val="0"/>
+          <w:lang w:eastAsia="it-IT"/>
+          <w14:ligatures w14:val="none"/>
+        </w:rPr>
+        <w:t xml:space="preserve"> alla </w:t>
+      </w:r>
+      <w:r>
+        <w:rPr>
+          <w:rFonts w:ascii="Times New Roman" w:eastAsia="Times New Roman" w:hAnsi="Times New Roman" w:cs="Times New Roman"/>
+          <w:kern w:val="0"/>
+          <w:lang w:eastAsia="it-IT"/>
+          <w14:ligatures w14:val="none"/>
+        </w:rPr>
+        <w:t>sezione</w:t>
+      </w:r>
+      <w:r>
+        <w:rPr>
+          <w:rFonts w:ascii="Times New Roman" w:eastAsia="Times New Roman" w:hAnsi="Times New Roman" w:cs="Times New Roman"/>
+          <w:kern w:val="0"/>
+          <w:lang w:eastAsia="it-IT"/>
+          <w14:ligatures w14:val="none"/>
+        </w:rPr>
+        <w:t xml:space="preserve"> </w:t>
+      </w:r>
+      <w:r>
+        <w:rPr>
+          <w:rFonts w:ascii="Times New Roman" w:eastAsia="Times New Roman" w:hAnsi="Times New Roman" w:cs="Times New Roman"/>
+          <w:kern w:val="0"/>
+          <w:lang w:eastAsia="it-IT"/>
+          <w14:ligatures w14:val="none"/>
+        </w:rPr>
+        <w:t>“</w:t>
+      </w:r>
+      <w:r>
+        <w:rPr>
+          <w:rFonts w:ascii="Times New Roman" w:eastAsia="Times New Roman" w:hAnsi="Times New Roman" w:cs="Times New Roman"/>
+          <w:kern w:val="0"/>
+          <w:lang w:eastAsia="it-IT"/>
+          <w14:ligatures w14:val="none"/>
+        </w:rPr>
+        <w:t>Le mie prenotazioni</w:t>
+      </w:r>
+      <w:r>
+        <w:rPr>
+          <w:rFonts w:ascii="Times New Roman" w:eastAsia="Times New Roman" w:hAnsi="Times New Roman" w:cs="Times New Roman"/>
+          <w:kern w:val="0"/>
+          <w:lang w:eastAsia="it-IT"/>
+          <w14:ligatures w14:val="none"/>
+        </w:rPr>
+        <w:t>”</w:t>
+      </w:r>
+      <w:r>
+        <w:rPr>
+          <w:rFonts w:ascii="Times New Roman" w:eastAsia="Times New Roman" w:hAnsi="Times New Roman" w:cs="Times New Roman"/>
+          <w:kern w:val="0"/>
+          <w:lang w:eastAsia="it-IT"/>
+          <w14:ligatures w14:val="none"/>
+        </w:rPr>
+        <w:t>, dove può visualizzare lo stato della visita come “Confermata”.</w:t>
+      </w:r>
+    </w:p>
+    <w:p>
+      <w:pPr>
+        <w:rPr>
+          <w:rFonts w:ascii="Times New Roman" w:eastAsia="Times New Roman" w:hAnsi="Times New Roman" w:cs="Times New Roman"/>
+          <w:kern w:val="0"/>
+          <w:lang w:eastAsia="it-IT"/>
+          <w14:ligatures w14:val="none"/>
+        </w:rPr>
+      </w:pPr>
+    </w:p>
+    <w:p>
+      <w:pPr>
+        <w:pStyle w:val="Titolo3"/>
+        <w:rPr>
+          <w:b/>
+          <w:bCs/>
+          <w:i/>
+          <w:iCs/>
+          <w:color w:val="000000" w:themeColor="text1"/>
+          <w:sz w:val="24"/>
+          <w:szCs w:val="24"/>
+        </w:rPr>
+      </w:pPr>
+      <w:r>
+        <w:rPr>
+          <w:b/>
+          <w:bCs/>
+          <w:i/>
+          <w:iCs/>
+          <w:color w:val="000000" w:themeColor="text1"/>
+          <w:sz w:val="24"/>
+          <w:szCs w:val="24"/>
+        </w:rPr>
+        <w:t>Scenario Gestione prenotazione da parte della segreteria</w:t>
+      </w:r>
+    </w:p>
+    <w:p>
+      <w:pPr>
+        <w:rPr>
+          <w:rFonts w:ascii="Times New Roman" w:eastAsia="Times New Roman" w:hAnsi="Times New Roman" w:cs="Times New Roman"/>
+          <w:kern w:val="0"/>
+          <w:lang w:eastAsia="it-IT"/>
+          <w14:ligatures w14:val="none"/>
+        </w:rPr>
+      </w:pPr>
+      <w:r>
+        <w:rPr>
+          <w:rFonts w:ascii="Times New Roman" w:eastAsia="Times New Roman" w:hAnsi="Times New Roman" w:cs="Times New Roman"/>
+          <w:kern w:val="0"/>
+          <w:lang w:eastAsia="it-IT"/>
+          <w14:ligatures w14:val="none"/>
+        </w:rPr>
+        <w:t>La segretaria Lucia Verdi accede al sistema MediBook tramite inserendo le proprie credenziali</w:t>
+      </w:r>
+      <w:r>
+        <w:rPr>
+          <w:rFonts w:ascii="Times New Roman" w:eastAsia="Times New Roman" w:hAnsi="Times New Roman" w:cs="Times New Roman"/>
+          <w:kern w:val="0"/>
+          <w:lang w:eastAsia="it-IT"/>
+          <w14:ligatures w14:val="none"/>
+        </w:rPr>
+        <w:t xml:space="preserve"> e accede alla home page</w:t>
+      </w:r>
+      <w:r>
+        <w:rPr>
+          <w:rFonts w:ascii="Times New Roman" w:eastAsia="Times New Roman" w:hAnsi="Times New Roman" w:cs="Times New Roman"/>
+          <w:kern w:val="0"/>
+          <w:lang w:eastAsia="it-IT"/>
+          <w14:ligatures w14:val="none"/>
+        </w:rPr>
+        <w:t>.</w:t>
+      </w:r>
+    </w:p>
+    <w:p>
+      <w:pPr>
+        <w:rPr>
+          <w:rFonts w:ascii="Times New Roman" w:eastAsia="Times New Roman" w:hAnsi="Times New Roman" w:cs="Times New Roman"/>
+          <w:kern w:val="0"/>
+          <w:lang w:eastAsia="it-IT"/>
+          <w14:ligatures w14:val="none"/>
+        </w:rPr>
+      </w:pPr>
+      <w:r>
+        <w:rPr>
+          <w:rFonts w:ascii="Times New Roman" w:eastAsia="Times New Roman" w:hAnsi="Times New Roman" w:cs="Times New Roman"/>
+          <w:kern w:val="0"/>
+          <w:lang w:eastAsia="it-IT"/>
+          <w14:ligatures w14:val="none"/>
+        </w:rPr>
+        <w:t xml:space="preserve">Il sistema verifica l’autenticazione e mostra la dashboard </w:t>
+      </w:r>
+      <w:r>
+        <w:rPr>
+          <w:rFonts w:ascii="Times New Roman" w:eastAsia="Times New Roman" w:hAnsi="Times New Roman" w:cs="Times New Roman"/>
+          <w:kern w:val="0"/>
+          <w:lang w:eastAsia="it-IT"/>
+          <w14:ligatures w14:val="none"/>
+        </w:rPr>
+        <w:t>delle prenotazioni effettuate per il giorno corrente</w:t>
+      </w:r>
+      <w:r>
+        <w:rPr>
+          <w:rFonts w:ascii="Times New Roman" w:eastAsia="Times New Roman" w:hAnsi="Times New Roman" w:cs="Times New Roman"/>
+          <w:kern w:val="0"/>
+          <w:lang w:eastAsia="it-IT"/>
+          <w14:ligatures w14:val="none"/>
+        </w:rPr>
+        <w:t>.</w:t>
+      </w:r>
+    </w:p>
+    <w:p>
+      <w:pPr>
+        <w:rPr>
+          <w:rFonts w:ascii="Times New Roman" w:eastAsia="Times New Roman" w:hAnsi="Times New Roman" w:cs="Times New Roman"/>
+          <w:kern w:val="0"/>
+          <w:lang w:eastAsia="it-IT"/>
+          <w14:ligatures w14:val="none"/>
+        </w:rPr>
+      </w:pPr>
+      <w:r>
+        <w:rPr>
+          <w:rFonts w:ascii="Times New Roman" w:eastAsia="Times New Roman" w:hAnsi="Times New Roman" w:cs="Times New Roman"/>
+          <w:kern w:val="0"/>
+          <w:lang w:eastAsia="it-IT"/>
+          <w14:ligatures w14:val="none"/>
+        </w:rPr>
+        <w:t>La segretaria</w:t>
+      </w:r>
+      <w:r>
+        <w:rPr>
+          <w:rFonts w:ascii="Times New Roman" w:eastAsia="Times New Roman" w:hAnsi="Times New Roman" w:cs="Times New Roman"/>
+          <w:kern w:val="0"/>
+          <w:lang w:eastAsia="it-IT"/>
+          <w14:ligatures w14:val="none"/>
+        </w:rPr>
+        <w:t xml:space="preserve"> </w:t>
+      </w:r>
+      <w:r>
+        <w:rPr>
+          <w:rFonts w:ascii="Times New Roman" w:eastAsia="Times New Roman" w:hAnsi="Times New Roman" w:cs="Times New Roman"/>
+          <w:kern w:val="0"/>
+          <w:lang w:eastAsia="it-IT"/>
+          <w14:ligatures w14:val="none"/>
+        </w:rPr>
+        <w:t>seleziona la sezione Gestione Appuntamenti per visualizzare l’elenco delle prenotazioni giornaliere.</w:t>
+      </w:r>
+    </w:p>
+    <w:p>
+      <w:pPr>
+        <w:rPr>
+          <w:rFonts w:ascii="Times New Roman" w:eastAsia="Times New Roman" w:hAnsi="Times New Roman" w:cs="Times New Roman"/>
+          <w:kern w:val="0"/>
+          <w:lang w:eastAsia="it-IT"/>
+          <w14:ligatures w14:val="none"/>
+        </w:rPr>
+      </w:pPr>
+      <w:r>
+        <w:rPr>
+          <w:rFonts w:ascii="Times New Roman" w:eastAsia="Times New Roman" w:hAnsi="Times New Roman" w:cs="Times New Roman"/>
+          <w:kern w:val="0"/>
+          <w:lang w:eastAsia="it-IT"/>
+          <w14:ligatures w14:val="none"/>
+        </w:rPr>
+        <w:t>Nota che il paziente Mario Rossi ha prenotato una visita di cardiologia con il dott. Bianchi.</w:t>
+      </w:r>
+    </w:p>
+    <w:p>
+      <w:pPr>
+        <w:rPr>
+          <w:rFonts w:ascii="Times New Roman" w:eastAsia="Times New Roman" w:hAnsi="Times New Roman" w:cs="Times New Roman"/>
+          <w:kern w:val="0"/>
+          <w:lang w:eastAsia="it-IT"/>
+          <w14:ligatures w14:val="none"/>
+        </w:rPr>
+      </w:pPr>
+      <w:r>
+        <w:rPr>
+          <w:rFonts w:ascii="Times New Roman" w:eastAsia="Times New Roman" w:hAnsi="Times New Roman" w:cs="Times New Roman"/>
+          <w:kern w:val="0"/>
+          <w:lang w:eastAsia="it-IT"/>
+          <w14:ligatures w14:val="none"/>
+        </w:rPr>
+        <w:t>A causa di un imprevisto, il medico non sarà disponibile nel pomeriggio.</w:t>
+      </w:r>
+      <w:r>
+        <w:rPr>
+          <w:rFonts w:ascii="Times New Roman" w:eastAsia="Times New Roman" w:hAnsi="Times New Roman" w:cs="Times New Roman"/>
+          <w:kern w:val="0"/>
+          <w:lang w:eastAsia="it-IT"/>
+          <w14:ligatures w14:val="none"/>
+        </w:rPr>
+        <w:t xml:space="preserve"> </w:t>
+      </w:r>
+      <w:r>
+        <w:rPr>
+          <w:rFonts w:ascii="Times New Roman" w:eastAsia="Times New Roman" w:hAnsi="Times New Roman" w:cs="Times New Roman"/>
+          <w:kern w:val="0"/>
+          <w:lang w:eastAsia="it-IT"/>
+          <w14:ligatures w14:val="none"/>
+        </w:rPr>
+        <w:t>La segretaria seleziona la prenotazione di Mario Rossi e clicca su Modifica Appuntamento.</w:t>
+      </w:r>
+    </w:p>
+    <w:p>
+      <w:pPr>
+        <w:rPr>
+          <w:rFonts w:ascii="Times New Roman" w:eastAsia="Times New Roman" w:hAnsi="Times New Roman" w:cs="Times New Roman"/>
+          <w:kern w:val="0"/>
+          <w:lang w:eastAsia="it-IT"/>
+          <w14:ligatures w14:val="none"/>
+        </w:rPr>
+      </w:pPr>
+      <w:r>
+        <w:rPr>
+          <w:rFonts w:ascii="Times New Roman" w:eastAsia="Times New Roman" w:hAnsi="Times New Roman" w:cs="Times New Roman"/>
+          <w:kern w:val="0"/>
+          <w:lang w:eastAsia="it-IT"/>
+          <w14:ligatures w14:val="none"/>
+        </w:rPr>
+        <w:t>Dal calendario seleziona la nuova data 16/11/2025 ore 10:00 e conferma la modifica.</w:t>
+      </w:r>
+      <w:r>
+        <w:rPr>
+          <w:rFonts w:ascii="Times New Roman" w:eastAsia="Times New Roman" w:hAnsi="Times New Roman" w:cs="Times New Roman"/>
+          <w:kern w:val="0"/>
+          <w:lang w:eastAsia="it-IT"/>
+          <w14:ligatures w14:val="none"/>
+        </w:rPr>
+        <w:t xml:space="preserve"> </w:t>
+      </w:r>
+    </w:p>
+    <w:p>
+      <w:pPr>
+        <w:rPr>
+          <w:rFonts w:ascii="Times New Roman" w:eastAsia="Times New Roman" w:hAnsi="Times New Roman" w:cs="Times New Roman"/>
+          <w:kern w:val="0"/>
+          <w:lang w:eastAsia="it-IT"/>
+          <w14:ligatures w14:val="none"/>
+        </w:rPr>
+      </w:pPr>
+      <w:r>
+        <w:rPr>
+          <w:rFonts w:ascii="Times New Roman" w:eastAsia="Times New Roman" w:hAnsi="Times New Roman" w:cs="Times New Roman"/>
+          <w:kern w:val="0"/>
+          <w:lang w:eastAsia="it-IT"/>
+          <w14:ligatures w14:val="none"/>
+        </w:rPr>
+        <w:t>Il sistema richiede conferma e mostra il riepilogo: medico, data, ora e tipo di visita.</w:t>
+      </w:r>
+    </w:p>
+    <w:p>
+      <w:pPr>
+        <w:rPr>
+          <w:rFonts w:ascii="Times New Roman" w:eastAsia="Times New Roman" w:hAnsi="Times New Roman" w:cs="Times New Roman"/>
+          <w:kern w:val="0"/>
+          <w:lang w:eastAsia="it-IT"/>
+          <w14:ligatures w14:val="none"/>
+        </w:rPr>
+      </w:pPr>
+      <w:r>
+        <w:rPr>
+          <w:rFonts w:ascii="Times New Roman" w:eastAsia="Times New Roman" w:hAnsi="Times New Roman" w:cs="Times New Roman"/>
+          <w:kern w:val="0"/>
+          <w:lang w:eastAsia="it-IT"/>
+          <w14:ligatures w14:val="none"/>
+        </w:rPr>
+        <w:t>La segretaria</w:t>
+      </w:r>
+      <w:r>
+        <w:rPr>
+          <w:rFonts w:ascii="Times New Roman" w:eastAsia="Times New Roman" w:hAnsi="Times New Roman" w:cs="Times New Roman"/>
+          <w:kern w:val="0"/>
+          <w:lang w:eastAsia="it-IT"/>
+          <w14:ligatures w14:val="none"/>
+        </w:rPr>
+        <w:t xml:space="preserve"> conferma.</w:t>
+      </w:r>
+    </w:p>
+    <w:p>
+      <w:pPr>
+        <w:rPr>
+          <w:rFonts w:ascii="Times New Roman" w:eastAsia="Times New Roman" w:hAnsi="Times New Roman" w:cs="Times New Roman"/>
+          <w:kern w:val="0"/>
+          <w:lang w:eastAsia="it-IT"/>
+          <w14:ligatures w14:val="none"/>
+        </w:rPr>
+      </w:pPr>
+      <w:r>
+        <w:rPr>
+          <w:rFonts w:ascii="Times New Roman" w:eastAsia="Times New Roman" w:hAnsi="Times New Roman" w:cs="Times New Roman"/>
+          <w:kern w:val="0"/>
+          <w:lang w:eastAsia="it-IT"/>
+          <w14:ligatures w14:val="none"/>
+        </w:rPr>
+        <w:t>Il sistema aggiorna automaticamente la disponibilità del medico e invia una notifica e-mail al paziente con il nuovo orario.</w:t>
+      </w:r>
+    </w:p>
+    <w:p>
+      <w:pPr>
+        <w:rPr>
+          <w:rFonts w:ascii="Times New Roman" w:eastAsia="Times New Roman" w:hAnsi="Times New Roman" w:cs="Times New Roman"/>
+          <w:kern w:val="0"/>
+          <w:lang w:eastAsia="it-IT"/>
+          <w14:ligatures w14:val="none"/>
+        </w:rPr>
+      </w:pPr>
+      <w:r>
+        <w:rPr>
+          <w:rFonts w:ascii="Times New Roman" w:eastAsia="Times New Roman" w:hAnsi="Times New Roman" w:cs="Times New Roman"/>
+          <w:kern w:val="0"/>
+          <w:lang w:eastAsia="it-IT"/>
+          <w14:ligatures w14:val="none"/>
+        </w:rPr>
+        <w:t>La segretaria</w:t>
+      </w:r>
+      <w:r>
+        <w:rPr>
+          <w:rFonts w:ascii="Times New Roman" w:eastAsia="Times New Roman" w:hAnsi="Times New Roman" w:cs="Times New Roman"/>
+          <w:kern w:val="0"/>
+          <w:lang w:eastAsia="it-IT"/>
+          <w14:ligatures w14:val="none"/>
+        </w:rPr>
+        <w:t xml:space="preserve"> visualizza la prenotazione aggiornata come “Riprogrammata”.</w:t>
+      </w:r>
+    </w:p>
+    <w:p>
+      <w:pPr>
+        <w:rPr>
+          <w:rFonts w:ascii="Times New Roman" w:eastAsia="Times New Roman" w:hAnsi="Times New Roman" w:cs="Times New Roman"/>
+          <w:kern w:val="0"/>
+          <w:lang w:eastAsia="it-IT"/>
+          <w14:ligatures w14:val="none"/>
+        </w:rPr>
+      </w:pPr>
+      <w:r>
+        <w:rPr>
+          <w:rFonts w:ascii="Times New Roman" w:eastAsia="Times New Roman" w:hAnsi="Times New Roman" w:cs="Times New Roman"/>
+          <w:kern w:val="0"/>
+          <w:lang w:eastAsia="it-IT"/>
+          <w14:ligatures w14:val="none"/>
+        </w:rPr>
+        <w:t xml:space="preserve">Il paziente </w:t>
+      </w:r>
+      <w:r>
+        <w:rPr>
+          <w:rFonts w:ascii="Times New Roman" w:eastAsia="Times New Roman" w:hAnsi="Times New Roman" w:cs="Times New Roman"/>
+          <w:kern w:val="0"/>
+          <w:lang w:eastAsia="it-IT"/>
+          <w14:ligatures w14:val="none"/>
+        </w:rPr>
+        <w:t>può accedere</w:t>
+      </w:r>
+      <w:r>
+        <w:rPr>
+          <w:rFonts w:ascii="Times New Roman" w:eastAsia="Times New Roman" w:hAnsi="Times New Roman" w:cs="Times New Roman"/>
+          <w:kern w:val="0"/>
+          <w:lang w:eastAsia="it-IT"/>
+          <w14:ligatures w14:val="none"/>
+        </w:rPr>
+        <w:t xml:space="preserve"> alla </w:t>
+      </w:r>
+      <w:r>
+        <w:rPr>
+          <w:rFonts w:ascii="Times New Roman" w:eastAsia="Times New Roman" w:hAnsi="Times New Roman" w:cs="Times New Roman"/>
+          <w:kern w:val="0"/>
+          <w:lang w:eastAsia="it-IT"/>
+          <w14:ligatures w14:val="none"/>
+        </w:rPr>
+        <w:t>sezione</w:t>
+      </w:r>
+      <w:r>
+        <w:rPr>
+          <w:rFonts w:ascii="Times New Roman" w:eastAsia="Times New Roman" w:hAnsi="Times New Roman" w:cs="Times New Roman"/>
+          <w:kern w:val="0"/>
+          <w:lang w:eastAsia="it-IT"/>
+          <w14:ligatures w14:val="none"/>
+        </w:rPr>
+        <w:t xml:space="preserve"> </w:t>
+      </w:r>
+      <w:r>
+        <w:rPr>
+          <w:rFonts w:ascii="Times New Roman" w:eastAsia="Times New Roman" w:hAnsi="Times New Roman" w:cs="Times New Roman"/>
+          <w:kern w:val="0"/>
+          <w:lang w:eastAsia="it-IT"/>
+          <w14:ligatures w14:val="none"/>
+        </w:rPr>
+        <w:t>“</w:t>
+      </w:r>
+      <w:r>
+        <w:rPr>
+          <w:rFonts w:ascii="Times New Roman" w:eastAsia="Times New Roman" w:hAnsi="Times New Roman" w:cs="Times New Roman"/>
+          <w:kern w:val="0"/>
+          <w:lang w:eastAsia="it-IT"/>
+          <w14:ligatures w14:val="none"/>
+        </w:rPr>
+        <w:t>Le mie prenotazioni</w:t>
+      </w:r>
+      <w:r>
+        <w:rPr>
+          <w:rFonts w:ascii="Times New Roman" w:eastAsia="Times New Roman" w:hAnsi="Times New Roman" w:cs="Times New Roman"/>
+          <w:kern w:val="0"/>
+          <w:lang w:eastAsia="it-IT"/>
+          <w14:ligatures w14:val="none"/>
+        </w:rPr>
+        <w:t>”</w:t>
+      </w:r>
+      <w:r>
+        <w:rPr>
+          <w:rFonts w:ascii="Times New Roman" w:eastAsia="Times New Roman" w:hAnsi="Times New Roman" w:cs="Times New Roman"/>
+          <w:kern w:val="0"/>
+          <w:lang w:eastAsia="it-IT"/>
+          <w14:ligatures w14:val="none"/>
+        </w:rPr>
+        <w:t>, dove può visualizzare lo stato della visita come “</w:t>
+      </w:r>
+      <w:r>
+        <w:rPr>
+          <w:rFonts w:ascii="Times New Roman" w:eastAsia="Times New Roman" w:hAnsi="Times New Roman" w:cs="Times New Roman"/>
+          <w:kern w:val="0"/>
+          <w:lang w:eastAsia="it-IT"/>
+          <w14:ligatures w14:val="none"/>
+        </w:rPr>
+        <w:t>Riprogrammata</w:t>
+      </w:r>
+      <w:r>
+        <w:rPr>
+          <w:rFonts w:ascii="Times New Roman" w:eastAsia="Times New Roman" w:hAnsi="Times New Roman" w:cs="Times New Roman"/>
+          <w:kern w:val="0"/>
+          <w:lang w:eastAsia="it-IT"/>
+          <w14:ligatures w14:val="none"/>
+        </w:rPr>
+        <w:t>”.</w:t>
+      </w:r>
+    </w:p>
+    <w:p>
+      <w:pPr>
+        <w:rPr>
+          <w:rFonts w:ascii="Times New Roman" w:eastAsia="Times New Roman" w:hAnsi="Times New Roman" w:cs="Times New Roman"/>
+          <w:kern w:val="0"/>
+          <w:lang w:eastAsia="it-IT"/>
+          <w14:ligatures w14:val="none"/>
+        </w:rPr>
+      </w:pPr>
+    </w:p>
+    <w:p>
+      <w:pPr>
+        <w:pStyle w:val="Titolo3"/>
+        <w:rPr>
+          <w:b/>
+          <w:bCs/>
+          <w:i/>
+          <w:iCs/>
+          <w:color w:val="000000" w:themeColor="text1"/>
+          <w:sz w:val="24"/>
+          <w:szCs w:val="24"/>
+        </w:rPr>
+      </w:pPr>
+      <w:r>
+        <w:rPr>
+          <w:b/>
+          <w:bCs/>
+          <w:i/>
+          <w:iCs/>
+          <w:color w:val="000000" w:themeColor="text1"/>
+          <w:sz w:val="24"/>
+          <w:szCs w:val="24"/>
+        </w:rPr>
+        <w:t>Scenario</w:t>
+      </w:r>
+      <w:r>
+        <w:rPr>
+          <w:rFonts w:eastAsia="Times New Roman"/>
+          <w:lang w:eastAsia="it-IT"/>
+        </w:rPr>
+        <w:t xml:space="preserve"> </w:t>
+      </w:r>
+      <w:r>
+        <w:rPr>
+          <w:b/>
+          <w:bCs/>
+          <w:i/>
+          <w:iCs/>
+          <w:color w:val="000000" w:themeColor="text1"/>
+          <w:sz w:val="24"/>
+          <w:szCs w:val="24"/>
+        </w:rPr>
+        <w:t>Consultazione agenda del medico</w:t>
+      </w:r>
+    </w:p>
+    <w:p>
+      <w:pPr>
+        <w:rPr>
+          <w:rFonts w:ascii="Times New Roman" w:eastAsia="Times New Roman" w:hAnsi="Times New Roman" w:cs="Times New Roman"/>
+          <w:kern w:val="0"/>
+          <w:lang w:eastAsia="it-IT"/>
+          <w14:ligatures w14:val="none"/>
+        </w:rPr>
+      </w:pPr>
+      <w:r>
+        <w:rPr>
+          <w:rFonts w:ascii="Times New Roman" w:eastAsia="Times New Roman" w:hAnsi="Times New Roman" w:cs="Times New Roman"/>
+          <w:kern w:val="0"/>
+          <w:lang w:eastAsia="it-IT"/>
+          <w14:ligatures w14:val="none"/>
+        </w:rPr>
+        <w:t>Il medico Giovanni Bianchi effettua l’accesso al portale MediBook utilizzando le proprie credenziali.</w:t>
+      </w:r>
+    </w:p>
+    <w:p>
+      <w:pPr>
+        <w:rPr>
+          <w:rFonts w:ascii="Times New Roman" w:eastAsia="Times New Roman" w:hAnsi="Times New Roman" w:cs="Times New Roman"/>
+          <w:kern w:val="0"/>
+          <w:u w:val="single"/>
+          <w:lang w:eastAsia="it-IT"/>
+          <w14:ligatures w14:val="none"/>
+        </w:rPr>
+      </w:pPr>
+      <w:r>
+        <w:rPr>
+          <w:rFonts w:ascii="Times New Roman" w:eastAsia="Times New Roman" w:hAnsi="Times New Roman" w:cs="Times New Roman"/>
+          <w:kern w:val="0"/>
+          <w:lang w:eastAsia="it-IT"/>
+          <w14:ligatures w14:val="none"/>
+        </w:rPr>
+        <w:t>Il sistema autentica il medico e mostra la sezione Area Medico, con una panoramica delle visite settimanali.</w:t>
+      </w:r>
+    </w:p>
+    <w:p>
+      <w:pPr>
+        <w:rPr>
+          <w:rFonts w:ascii="Times New Roman" w:eastAsia="Times New Roman" w:hAnsi="Times New Roman" w:cs="Times New Roman"/>
+          <w:kern w:val="0"/>
+          <w:lang w:eastAsia="it-IT"/>
+          <w14:ligatures w14:val="none"/>
+        </w:rPr>
+      </w:pPr>
+      <w:r>
+        <w:rPr>
+          <w:rFonts w:ascii="Times New Roman" w:eastAsia="Times New Roman" w:hAnsi="Times New Roman" w:cs="Times New Roman"/>
+          <w:kern w:val="0"/>
+          <w:lang w:eastAsia="it-IT"/>
+          <w14:ligatures w14:val="none"/>
+        </w:rPr>
+        <w:t>Il dott. Bianchi accede alla sezione Agenda Personale, dove visualizza tutte le visite prenotate dai pazienti.</w:t>
+      </w:r>
+    </w:p>
+    <w:p>
+      <w:pPr>
+        <w:rPr>
+          <w:rFonts w:ascii="Times New Roman" w:eastAsia="Times New Roman" w:hAnsi="Times New Roman" w:cs="Times New Roman"/>
+          <w:kern w:val="0"/>
+          <w:lang w:eastAsia="it-IT"/>
+          <w14:ligatures w14:val="none"/>
+        </w:rPr>
+      </w:pPr>
+      <w:r>
+        <w:rPr>
+          <w:rFonts w:ascii="Times New Roman" w:eastAsia="Times New Roman" w:hAnsi="Times New Roman" w:cs="Times New Roman"/>
+          <w:kern w:val="0"/>
+          <w:lang w:eastAsia="it-IT"/>
+          <w14:ligatures w14:val="none"/>
+        </w:rPr>
+        <w:t>Seleziona la data 16/11/2025 e nota la visita riprogrammata di Mario Rossi.</w:t>
+      </w:r>
+    </w:p>
+    <w:p>
+      <w:pPr>
+        <w:rPr>
+          <w:rFonts w:ascii="Times New Roman" w:eastAsia="Times New Roman" w:hAnsi="Times New Roman" w:cs="Times New Roman"/>
+          <w:kern w:val="0"/>
+          <w:lang w:eastAsia="it-IT"/>
+          <w14:ligatures w14:val="none"/>
+        </w:rPr>
+      </w:pPr>
+      <w:r>
+        <w:rPr>
+          <w:rFonts w:ascii="Times New Roman" w:eastAsia="Times New Roman" w:hAnsi="Times New Roman" w:cs="Times New Roman"/>
+          <w:kern w:val="0"/>
+          <w:lang w:eastAsia="it-IT"/>
+          <w14:ligatures w14:val="none"/>
+        </w:rPr>
+        <w:t>Il medico clicca sul nome del paziente per visualizzare i dettagli della prenotazione</w:t>
+      </w:r>
+      <w:r>
+        <w:rPr>
+          <w:rFonts w:ascii="Times New Roman" w:eastAsia="Times New Roman" w:hAnsi="Times New Roman" w:cs="Times New Roman"/>
+          <w:kern w:val="0"/>
+          <w:lang w:eastAsia="it-IT"/>
+          <w14:ligatures w14:val="none"/>
+        </w:rPr>
+        <w:t xml:space="preserve"> </w:t>
+      </w:r>
+      <w:r>
+        <w:rPr>
+          <w:rFonts w:ascii="Times New Roman" w:eastAsia="Times New Roman" w:hAnsi="Times New Roman" w:cs="Times New Roman"/>
+          <w:kern w:val="0"/>
+          <w:lang w:eastAsia="it-IT"/>
+          <w14:ligatures w14:val="none"/>
+        </w:rPr>
+        <w:t>e lo storico delle visite precedenti.</w:t>
+      </w:r>
+    </w:p>
+    <w:p>
+      <w:pPr>
+        <w:rPr>
+          <w:rFonts w:ascii="Times New Roman" w:eastAsia="Times New Roman" w:hAnsi="Times New Roman" w:cs="Times New Roman"/>
+          <w:kern w:val="0"/>
+          <w:lang w:eastAsia="it-IT"/>
+          <w14:ligatures w14:val="none"/>
+        </w:rPr>
+      </w:pPr>
+      <w:r>
+        <w:rPr>
+          <w:rFonts w:ascii="Times New Roman" w:eastAsia="Times New Roman" w:hAnsi="Times New Roman" w:cs="Times New Roman"/>
+          <w:kern w:val="0"/>
+          <w:lang w:eastAsia="it-IT"/>
+          <w14:ligatures w14:val="none"/>
+        </w:rPr>
+        <w:t>Nella sezione Gestione Visita i</w:t>
+      </w:r>
+      <w:r>
+        <w:rPr>
+          <w:rFonts w:ascii="Times New Roman" w:eastAsia="Times New Roman" w:hAnsi="Times New Roman" w:cs="Times New Roman"/>
+          <w:kern w:val="0"/>
+          <w:lang w:eastAsia="it-IT"/>
+          <w14:ligatures w14:val="none"/>
+        </w:rPr>
+        <w:t>l medico può contrassegnare le visite come Effettuate o Annullate e aggiungere eventuali referti digitali, che saranno resi disponibili al paziente al termine della visita</w:t>
+      </w:r>
+      <w:r>
+        <w:rPr>
+          <w:rFonts w:ascii="Times New Roman" w:eastAsia="Times New Roman" w:hAnsi="Times New Roman" w:cs="Times New Roman"/>
+          <w:kern w:val="0"/>
+          <w:lang w:eastAsia="it-IT"/>
+          <w14:ligatures w14:val="none"/>
+        </w:rPr>
+        <w:t xml:space="preserve"> in formato pdf</w:t>
+      </w:r>
+      <w:r>
+        <w:rPr>
+          <w:rFonts w:ascii="Times New Roman" w:eastAsia="Times New Roman" w:hAnsi="Times New Roman" w:cs="Times New Roman"/>
+          <w:kern w:val="0"/>
+          <w:lang w:eastAsia="it-IT"/>
+          <w14:ligatures w14:val="none"/>
+        </w:rPr>
+        <w:t>.</w:t>
+      </w:r>
+    </w:p>
+    <w:p>
+      <w:pPr>
+        <w:rPr>
+          <w:rFonts w:ascii="Times New Roman" w:eastAsia="Times New Roman" w:hAnsi="Times New Roman" w:cs="Times New Roman"/>
+          <w:kern w:val="0"/>
+          <w:lang w:eastAsia="it-IT"/>
+          <w14:ligatures w14:val="none"/>
+        </w:rPr>
+      </w:pPr>
+      <w:r>
+        <w:rPr>
+          <w:rFonts w:ascii="Times New Roman" w:eastAsia="Times New Roman" w:hAnsi="Times New Roman" w:cs="Times New Roman"/>
+          <w:kern w:val="0"/>
+          <w:lang w:eastAsia="it-IT"/>
+          <w14:ligatures w14:val="none"/>
+        </w:rPr>
+        <w:t>Il sistema richiede conferma e mostra il riepilogo.</w:t>
+      </w:r>
+    </w:p>
+    <w:p>
+      <w:pPr>
+        <w:rPr>
+          <w:rFonts w:ascii="Times New Roman" w:eastAsia="Times New Roman" w:hAnsi="Times New Roman" w:cs="Times New Roman"/>
+          <w:kern w:val="0"/>
+          <w:lang w:eastAsia="it-IT"/>
+          <w14:ligatures w14:val="none"/>
+        </w:rPr>
+      </w:pPr>
+      <w:r>
+        <w:rPr>
+          <w:rFonts w:ascii="Times New Roman" w:eastAsia="Times New Roman" w:hAnsi="Times New Roman" w:cs="Times New Roman"/>
+          <w:kern w:val="0"/>
+          <w:lang w:eastAsia="it-IT"/>
+          <w14:ligatures w14:val="none"/>
+        </w:rPr>
+        <w:t xml:space="preserve">Il medico </w:t>
+      </w:r>
+      <w:r>
+        <w:rPr>
+          <w:rFonts w:ascii="Times New Roman" w:eastAsia="Times New Roman" w:hAnsi="Times New Roman" w:cs="Times New Roman"/>
+          <w:kern w:val="0"/>
+          <w:lang w:eastAsia="it-IT"/>
+          <w14:ligatures w14:val="none"/>
+        </w:rPr>
+        <w:t>conferma.</w:t>
+      </w:r>
+    </w:p>
+    <w:p>
+      <w:pPr>
+        <w:rPr>
+          <w:rFonts w:ascii="Times New Roman" w:eastAsia="Times New Roman" w:hAnsi="Times New Roman" w:cs="Times New Roman"/>
+          <w:kern w:val="0"/>
+          <w:lang w:eastAsia="it-IT"/>
+          <w14:ligatures w14:val="none"/>
+        </w:rPr>
+      </w:pPr>
+      <w:r>
+        <w:rPr>
+          <w:rFonts w:ascii="Times New Roman" w:eastAsia="Times New Roman" w:hAnsi="Times New Roman" w:cs="Times New Roman"/>
+          <w:kern w:val="0"/>
+          <w:lang w:eastAsia="it-IT"/>
+          <w14:ligatures w14:val="none"/>
+        </w:rPr>
+        <w:t>Il sistema aggiorna lo stato della visita e invia una notifica al paziente.</w:t>
+      </w:r>
+    </w:p>
+    <w:p>
+      <w:pPr>
+        <w:rPr>
+          <w:rFonts w:ascii="Times New Roman" w:eastAsia="Times New Roman" w:hAnsi="Times New Roman" w:cs="Times New Roman"/>
+          <w:kern w:val="0"/>
+          <w:lang w:eastAsia="it-IT"/>
+          <w14:ligatures w14:val="none"/>
+        </w:rPr>
+      </w:pPr>
+      <w:r>
+        <w:rPr>
+          <w:rFonts w:ascii="Times New Roman" w:eastAsia="Times New Roman" w:hAnsi="Times New Roman" w:cs="Times New Roman"/>
+          <w:kern w:val="0"/>
+          <w:lang w:eastAsia="it-IT"/>
+          <w14:ligatures w14:val="none"/>
+        </w:rPr>
+        <w:t>Mario accede alla sezione</w:t>
+      </w:r>
+      <w:r>
+        <w:rPr>
+          <w:rFonts w:ascii="Times New Roman" w:eastAsia="Times New Roman" w:hAnsi="Times New Roman" w:cs="Times New Roman"/>
+          <w:kern w:val="0"/>
+          <w:lang w:eastAsia="it-IT"/>
+          <w14:ligatures w14:val="none"/>
+        </w:rPr>
+        <w:t xml:space="preserve"> Referti </w:t>
+      </w:r>
+      <w:r>
+        <w:rPr>
+          <w:rFonts w:ascii="Times New Roman" w:eastAsia="Times New Roman" w:hAnsi="Times New Roman" w:cs="Times New Roman"/>
+          <w:kern w:val="0"/>
+          <w:lang w:eastAsia="it-IT"/>
+          <w14:ligatures w14:val="none"/>
+        </w:rPr>
+        <w:t>e può scaricare il documento o consultarlo online.</w:t>
+      </w:r>
+    </w:p>
+    <w:p>
+      <w:pPr>
+        <w:rPr>
+          <w:rFonts w:ascii="Times New Roman" w:eastAsia="Times New Roman" w:hAnsi="Times New Roman" w:cs="Times New Roman"/>
+          <w:kern w:val="0"/>
+          <w:lang w:eastAsia="it-IT"/>
+          <w14:ligatures w14:val="none"/>
+        </w:rPr>
+      </w:pPr>
+    </w:p>
+    <w:p>
+      <w:pPr>
+        <w:pStyle w:val="Titolo3"/>
+        <w:rPr>
+          <w:b/>
+          <w:bCs/>
+          <w:i/>
+          <w:iCs/>
+          <w:color w:val="000000" w:themeColor="text1"/>
+          <w:sz w:val="24"/>
+          <w:szCs w:val="24"/>
+        </w:rPr>
+      </w:pPr>
+      <w:r>
+        <w:rPr>
+          <w:b/>
+          <w:bCs/>
+          <w:i/>
+          <w:iCs/>
+          <w:color w:val="000000" w:themeColor="text1"/>
+          <w:sz w:val="24"/>
+          <w:szCs w:val="24"/>
+        </w:rPr>
+        <w:t>Casi d’uso</w:t>
+      </w:r>
+    </w:p>
+    <w:p>
+      <w:pPr>
+        <w:pStyle w:val="Titolo4"/>
+        <w:rPr>
+          <w:b/>
+          <w:bCs/>
+          <w:color w:val="000000" w:themeColor="text1"/>
+        </w:rPr>
+      </w:pPr>
+      <w:r>
+        <w:rPr>
+          <w:b/>
+          <w:bCs/>
+          <w:color w:val="000000" w:themeColor="text1"/>
+        </w:rPr>
+        <w:t>UC 1: Autenticazione</w:t>
+      </w:r>
+    </w:p>
+    <w:p>
+      <w:pPr>
+        <w:rPr>
+          <w:rFonts w:ascii="Times New Roman" w:eastAsia="Times New Roman" w:hAnsi="Times New Roman" w:cs="Times New Roman"/>
+          <w:kern w:val="0"/>
+          <w:lang w:eastAsia="it-IT"/>
+          <w14:ligatures w14:val="none"/>
+        </w:rPr>
+      </w:pPr>
+      <w:r>
+        <w:rPr>
+          <w:rFonts w:ascii="Times New Roman" w:eastAsia="Times New Roman" w:hAnsi="Times New Roman" w:cs="Times New Roman"/>
+          <w:kern w:val="0"/>
+          <w:lang w:eastAsia="it-IT"/>
+          <w14:ligatures w14:val="none"/>
+        </w:rPr>
+        <w:t>Attore: Utente</w:t>
+      </w:r>
+    </w:p>
+    <w:p>
+      <w:pPr>
+        <w:rPr>
+          <w:rFonts w:ascii="Times New Roman" w:eastAsia="Times New Roman" w:hAnsi="Times New Roman" w:cs="Times New Roman"/>
+          <w:kern w:val="0"/>
+          <w:lang w:eastAsia="it-IT"/>
+          <w14:ligatures w14:val="none"/>
+        </w:rPr>
+      </w:pPr>
+      <w:r>
+        <w:rPr>
+          <w:rFonts w:ascii="Times New Roman" w:eastAsia="Times New Roman" w:hAnsi="Times New Roman" w:cs="Times New Roman"/>
+          <w:kern w:val="0"/>
+          <w:lang w:eastAsia="it-IT"/>
+          <w14:ligatures w14:val="none"/>
+        </w:rPr>
+        <w:t>Entry Condition: L’utente si trova sulla home page di Esse3 con la schermata di autenticazione</w:t>
+      </w:r>
+    </w:p>
+    <w:p>
+      <w:pPr>
+        <w:rPr>
+          <w:rFonts w:ascii="Times New Roman" w:eastAsia="Times New Roman" w:hAnsi="Times New Roman" w:cs="Times New Roman"/>
+          <w:kern w:val="0"/>
+          <w:lang w:eastAsia="it-IT"/>
+          <w14:ligatures w14:val="none"/>
+        </w:rPr>
+      </w:pPr>
+      <w:r>
+        <w:rPr>
+          <w:rFonts w:ascii="Times New Roman" w:eastAsia="Times New Roman" w:hAnsi="Times New Roman" w:cs="Times New Roman"/>
+          <w:kern w:val="0"/>
+          <w:lang w:eastAsia="it-IT"/>
+          <w14:ligatures w14:val="none"/>
+        </w:rPr>
+        <w:t>Flusso di eventi:</w:t>
+      </w:r>
+    </w:p>
+    <w:p>
+      <w:pPr>
+        <w:pStyle w:val="Paragrafoelenco"/>
+        <w:numPr>
+          <w:ilvl w:val="0"/>
+          <w:numId w:val="3"/>
+        </w:numPr>
+        <w:rPr>
+          <w:rFonts w:ascii="Times New Roman" w:eastAsia="Times New Roman" w:hAnsi="Times New Roman" w:cs="Times New Roman"/>
+          <w:kern w:val="0"/>
+          <w:lang w:eastAsia="it-IT"/>
+          <w14:ligatures w14:val="none"/>
+        </w:rPr>
+      </w:pPr>
+      <w:r>
+        <w:rPr>
+          <w:rFonts w:ascii="Times New Roman" w:eastAsia="Times New Roman" w:hAnsi="Times New Roman" w:cs="Times New Roman"/>
+          <w:kern w:val="0"/>
+          <w:lang w:eastAsia="it-IT"/>
+          <w14:ligatures w14:val="none"/>
+        </w:rPr>
+        <w:t>L’utente inserisce username e password</w:t>
+      </w:r>
+    </w:p>
+    <w:p>
+      <w:pPr>
+        <w:pStyle w:val="Paragrafoelenco"/>
+        <w:numPr>
+          <w:ilvl w:val="0"/>
+          <w:numId w:val="3"/>
+        </w:numPr>
+        <w:rPr>
+          <w:rFonts w:ascii="Times New Roman" w:eastAsia="Times New Roman" w:hAnsi="Times New Roman" w:cs="Times New Roman"/>
+          <w:kern w:val="0"/>
+          <w:lang w:eastAsia="it-IT"/>
+          <w14:ligatures w14:val="none"/>
+        </w:rPr>
+      </w:pPr>
+      <w:r>
+        <w:rPr>
+          <w:rFonts w:ascii="Times New Roman" w:eastAsia="Times New Roman" w:hAnsi="Times New Roman" w:cs="Times New Roman"/>
+          <w:kern w:val="0"/>
+          <w:lang w:eastAsia="it-IT"/>
+          <w14:ligatures w14:val="none"/>
+        </w:rPr>
+        <w:t>L’utente invia i dati all’utente</w:t>
+      </w:r>
+    </w:p>
+    <w:p>
+      <w:pPr>
+        <w:pStyle w:val="Paragrafoelenco"/>
+        <w:numPr>
+          <w:ilvl w:val="0"/>
+          <w:numId w:val="3"/>
+        </w:numPr>
+        <w:rPr>
+          <w:rFonts w:ascii="Times New Roman" w:eastAsia="Times New Roman" w:hAnsi="Times New Roman" w:cs="Times New Roman"/>
+          <w:kern w:val="0"/>
+          <w:lang w:eastAsia="it-IT"/>
+          <w14:ligatures w14:val="none"/>
+        </w:rPr>
+      </w:pPr>
+      <w:r>
+        <w:rPr>
+          <w:rFonts w:ascii="Times New Roman" w:eastAsia="Times New Roman" w:hAnsi="Times New Roman" w:cs="Times New Roman"/>
+          <w:kern w:val="0"/>
+          <w:lang w:eastAsia="it-IT"/>
+          <w14:ligatures w14:val="none"/>
+        </w:rPr>
+        <w:t>Il sistema controlla le credenziali e il controllo ha esito positivo</w:t>
+      </w:r>
+    </w:p>
+    <w:p>
+      <w:pPr>
+        <w:pStyle w:val="Paragrafoelenco"/>
+        <w:numPr>
+          <w:ilvl w:val="0"/>
+          <w:numId w:val="3"/>
+        </w:numPr>
+        <w:rPr>
+          <w:rFonts w:ascii="Times New Roman" w:eastAsia="Times New Roman" w:hAnsi="Times New Roman" w:cs="Times New Roman"/>
+          <w:kern w:val="0"/>
+          <w:lang w:eastAsia="it-IT"/>
+          <w14:ligatures w14:val="none"/>
+        </w:rPr>
+      </w:pPr>
+      <w:r>
+        <w:rPr>
+          <w:rFonts w:ascii="Times New Roman" w:eastAsia="Times New Roman" w:hAnsi="Times New Roman" w:cs="Times New Roman"/>
+          <w:kern w:val="0"/>
+          <w:lang w:eastAsia="it-IT"/>
+          <w14:ligatures w14:val="none"/>
+        </w:rPr>
+        <w:t>Il sistema reindirizza l’utente alla sua home page</w:t>
+      </w:r>
+    </w:p>
+    <w:p>
+      <w:pPr>
+        <w:rPr>
+          <w:rFonts w:ascii="Times New Roman" w:eastAsia="Times New Roman" w:hAnsi="Times New Roman" w:cs="Times New Roman"/>
+          <w:kern w:val="0"/>
+          <w:lang w:eastAsia="it-IT"/>
+          <w14:ligatures w14:val="none"/>
+        </w:rPr>
+      </w:pPr>
+      <w:r>
+        <w:t>Exit Condition: L’utente è autenticato e si trova sulla sua home page</w:t>
+      </w:r>
+    </w:p>
+    <w:p>
+      <w:pPr>
+        <w:rPr>
+          <w:rFonts w:ascii="Times New Roman" w:eastAsia="Times New Roman" w:hAnsi="Times New Roman" w:cs="Times New Roman"/>
+          <w:kern w:val="0"/>
+          <w:lang w:eastAsia="it-IT"/>
+          <w14:ligatures w14:val="none"/>
+        </w:rPr>
+      </w:pPr>
+      <w:r>
+        <w:rPr>
+          <w:rFonts w:ascii="Times New Roman" w:eastAsia="Times New Roman" w:hAnsi="Times New Roman" w:cs="Times New Roman"/>
+          <w:kern w:val="0"/>
+          <w:lang w:eastAsia="it-IT"/>
+          <w14:ligatures w14:val="none"/>
+        </w:rPr>
+        <w:t>Flussi alternativi / Eccezioni: Se al punto 3 il sistema rileva credenziali non corrette, il sistema mostrerà il messaggio di errore “username o password non corrette” e ripresenterà la schermata di autenticazione (UC 1.1 Autenticazione Fallita)</w:t>
+      </w:r>
+    </w:p>
+    <w:p>
+      <w:pPr>
+        <w:rPr>
+          <w:rFonts w:ascii="Times New Roman" w:eastAsia="Times New Roman" w:hAnsi="Times New Roman" w:cs="Times New Roman"/>
+          <w:kern w:val="0"/>
+          <w:lang w:eastAsia="it-IT"/>
+          <w14:ligatures w14:val="none"/>
+        </w:rPr>
+      </w:pPr>
+    </w:p>
+    <w:p>
+      <w:pPr>
+        <w:pStyle w:val="Titolo2"/>
+        <w:rPr>
+          <w:rFonts w:ascii="Times New Roman" w:hAnsi="Times New Roman" w:cs="Times New Roman"/>
+          <w:b/>
+          <w:bCs/>
+        </w:rPr>
+      </w:pPr>
+      <w:r>
+        <w:rPr>
+          <w:rFonts w:ascii="Times New Roman" w:hAnsi="Times New Roman" w:cs="Times New Roman"/>
+          <w:b/>
+          <w:bCs/>
+        </w:rPr>
+        <w:t>Requisiti Funzionali</w:t>
+      </w:r>
+    </w:p>
+    <w:p>
+      <w:r>
+        <w:t>Sample</w:t>
+      </w:r>
+    </w:p>
+    <w:p>
+      <w:pPr>
+        <w:pStyle w:val="Titolo2"/>
+        <w:rPr>
+          <w:rFonts w:ascii="Times New Roman" w:hAnsi="Times New Roman" w:cs="Times New Roman"/>
+          <w:b/>
+          <w:bCs/>
+        </w:rPr>
+      </w:pPr>
+      <w:r>
+        <w:rPr>
+          <w:rFonts w:ascii="Times New Roman" w:hAnsi="Times New Roman" w:cs="Times New Roman"/>
+          <w:b/>
+          <w:bCs/>
+        </w:rPr>
+        <w:t>Requisiti non funzionali</w:t>
+      </w:r>
+    </w:p>
+    <w:p>
+      <w:pPr>
+        <w:rPr>
+          <w:u w:val="single"/>
+        </w:rPr>
+      </w:pPr>
+      <w:r>
+        <w:t>Sample</w:t>
+      </w:r>
+    </w:p>
+    <w:p>
+      <w:pPr>
+        <w:pStyle w:val="Titolo2"/>
+        <w:rPr>
+          <w:rFonts w:ascii="Times New Roman" w:hAnsi="Times New Roman" w:cs="Times New Roman"/>
+          <w:b/>
+          <w:bCs/>
+        </w:rPr>
+      </w:pPr>
+      <w:r>
+        <w:rPr>
+          <w:rFonts w:ascii="Times New Roman" w:hAnsi="Times New Roman" w:cs="Times New Roman"/>
+          <w:b/>
+          <w:bCs/>
+        </w:rPr>
+        <w:lastRenderedPageBreak/>
+        <w:t>Target environment</w:t>
+      </w:r>
+    </w:p>
+    <w:p>
+      <w:r>
+        <w:t>Sample</w:t>
+      </w:r>
+    </w:p>
+    <w:p>
+      <w:pPr>
+        <w:pStyle w:val="Titolo2"/>
+        <w:rPr>
+          <w:rFonts w:ascii="Times New Roman" w:hAnsi="Times New Roman" w:cs="Times New Roman"/>
+          <w:b/>
+          <w:bCs/>
+        </w:rPr>
+      </w:pPr>
+      <w:r>
+        <w:rPr>
+          <w:rFonts w:ascii="Times New Roman" w:hAnsi="Times New Roman" w:cs="Times New Roman"/>
+          <w:b/>
+          <w:bCs/>
+        </w:rPr>
+        <w:t>Deliverable &amp; deadlines</w:t>
+      </w:r>
+    </w:p>
+    <w:p>
+      <w:r>
+        <w:t>sample</w:t>
       </w:r>
     </w:p>
     <w:sectPr>
@@ -395,7 +1965,7 @@
 </file>
 
 <file path=word/numbering.xml><?xml version="1.0" encoding="utf-8"?>
-<w:numbering xmlns:wpc="http://schemas.microsoft.com/office/word/2010/wordprocessingCanvas" xmlns:cx="http://schemas.microsoft.com/office/drawing/2014/chartex" xmlns:cx1="http://schemas.microsoft.com/office/drawing/2015/9/8/chartex" xmlns:cx2="http://schemas.microsoft.com/office/drawing/2015/10/21/chartex" xmlns:cx3="http://schemas.microsoft.com/office/drawing/2016/5/9/chartex" xmlns:cx4="http://schemas.microsoft.com/office/drawing/2016/5/10/chartex" xmlns:cx5="http://schemas.microsoft.com/office/drawing/2016/5/11/chartex" xmlns:cx6="http://schemas.microsoft.com/office/drawing/2016/5/12/chartex" xmlns:cx7="http://schemas.microsoft.com/office/drawing/2016/5/13/chartex" xmlns:cx8="http://schemas.microsoft.com/office/drawing/2016/5/14/chartex" xmlns:mc="http://schemas.openxmlformats.org/markup-compatibility/2006" xmlns:aink="http://schemas.microsoft.com/office/drawing/2016/ink" xmlns:am3d="http://schemas.microsoft.com/office/drawing/2017/model3d" xmlns:o="urn:schemas-microsoft-com:office:office" xmlns:oel="http://schemas.microsoft.com/office/2019/extlst" xmlns:r="http://schemas.openxmlformats.org/officeDocument/2006/relationships" xmlns:m="http://schemas.openxmlformats.org/officeDocument/2006/math" xmlns:v="urn:schemas-microsoft-com:vml" xmlns:wp14="http://schemas.microsoft.com/office/word/2010/wordprocessingDrawing" xmlns:wp="http://schemas.openxmlformats.org/drawingml/2006/wordprocessingDrawing" xmlns:w10="urn:schemas-microsoft-com:office:word" xmlns:w="http://schemas.openxmlformats.org/wordprocessingml/2006/main" xmlns:w14="http://schemas.microsoft.com/office/word/2010/wordml" xmlns:w15="http://schemas.microsoft.com/office/word/2012/wordml" xmlns:w16cex="http://schemas.microsoft.com/office/word/2018/wordml/cex" xmlns:w16cid="http://schemas.microsoft.com/office/word/2016/wordml/cid" xmlns:w16="http://schemas.microsoft.com/office/word/2018/wordml" xmlns:w16sdtdh="http://schemas.microsoft.com/office/word/2020/wordml/sdtdatahash" xmlns:w16se="http://schemas.microsoft.com/office/word/2015/wordml/symex" xmlns:wpg="http://schemas.microsoft.com/office/word/2010/wordprocessingGroup" xmlns:wpi="http://schemas.microsoft.com/office/word/2010/wordprocessingInk" xmlns:wne="http://schemas.microsoft.com/office/word/2006/wordml" xmlns:wps="http://schemas.microsoft.com/office/word/2010/wordprocessingShape" mc:Ignorable="w14 w15 w16se w16cid w16 w16cex w16sdtdh wp14">
+<w:numbering xmlns:wpc="http://schemas.microsoft.com/office/word/2010/wordprocessingCanvas" xmlns:cx="http://schemas.microsoft.com/office/drawing/2014/chartex" xmlns:cx1="http://schemas.microsoft.com/office/drawing/2015/9/8/chartex" xmlns:cx2="http://schemas.microsoft.com/office/drawing/2015/10/21/chartex" xmlns:cx3="http://schemas.microsoft.com/office/drawing/2016/5/9/chartex" xmlns:cx4="http://schemas.microsoft.com/office/drawing/2016/5/10/chartex" xmlns:cx5="http://schemas.microsoft.com/office/drawing/2016/5/11/chartex" xmlns:cx6="http://schemas.microsoft.com/office/drawing/2016/5/12/chartex" xmlns:cx7="http://schemas.microsoft.com/office/drawing/2016/5/13/chartex" xmlns:cx8="http://schemas.microsoft.com/office/drawing/2016/5/14/chartex" xmlns:mc="http://schemas.openxmlformats.org/markup-compatibility/2006" xmlns:aink="http://schemas.microsoft.com/office/drawing/2016/ink" xmlns:am3d="http://schemas.microsoft.com/office/drawing/2017/model3d" xmlns:o="urn:schemas-microsoft-com:office:office" xmlns:oel="http://schemas.microsoft.com/office/2019/extlst" xmlns:r="http://schemas.openxmlformats.org/officeDocument/2006/relationships" xmlns:m="http://schemas.openxmlformats.org/officeDocument/2006/math" xmlns:v="urn:schemas-microsoft-com:vml" xmlns:wp14="http://schemas.microsoft.com/office/word/2010/wordprocessingDrawing" xmlns:wp="http://schemas.openxmlformats.org/drawingml/2006/wordprocessingDrawing" xmlns:w10="urn:schemas-microsoft-com:office:word" xmlns:w="http://schemas.openxmlformats.org/wordprocessingml/2006/main" xmlns:w14="http://schemas.microsoft.com/office/word/2010/wordml" xmlns:w15="http://schemas.microsoft.com/office/word/2012/wordml" xmlns:w16cex="http://schemas.microsoft.com/office/word/2018/wordml/cex" xmlns:w16cid="http://schemas.microsoft.com/office/word/2016/wordml/cid" xmlns:w16="http://schemas.microsoft.com/office/word/2018/wordml" xmlns:w16du="http://schemas.microsoft.com/office/word/2023/wordml/word16du" xmlns:w16sdtdh="http://schemas.microsoft.com/office/word/2020/wordml/sdtdatahash" xmlns:w16sdtfl="http://schemas.microsoft.com/office/word/2024/wordml/sdtformatlock" xmlns:w16se="http://schemas.microsoft.com/office/word/2015/wordml/symex" xmlns:wpg="http://schemas.microsoft.com/office/word/2010/wordprocessingGroup" xmlns:wpi="http://schemas.microsoft.com/office/word/2010/wordprocessingInk" xmlns:wne="http://schemas.microsoft.com/office/word/2006/wordml" xmlns:wps="http://schemas.microsoft.com/office/word/2010/wordprocessingShape" mc:Ignorable="w14 w15 w16se w16cid w16 w16cex w16sdtdh w16sdtfl w16du wp14">
   <w:abstractNum w:abstractNumId="0" w15:restartNumberingAfterBreak="0">
     <w:nsid w:val="3C1824A6"/>
     <w:multiLevelType w:val="hybridMultilevel"/>
@@ -510,6 +2080,92 @@
     </w:lvl>
   </w:abstractNum>
   <w:abstractNum w:abstractNumId="1" w15:restartNumberingAfterBreak="0">
+    <w:nsid w:val="541851F3"/>
+    <w:multiLevelType w:val="hybridMultilevel"/>
+    <w:tmpl w:val="31141750"/>
+    <w:lvl w:ilvl="0" w:tplc="0410000F">
+      <w:start w:val="1"/>
+      <w:numFmt w:val="decimal"/>
+      <w:lvlText w:val="%1."/>
+      <w:lvlJc w:val="left"/>
+      <w:pPr>
+        <w:ind w:left="720" w:hanging="360"/>
+      </w:pPr>
+    </w:lvl>
+    <w:lvl w:ilvl="1" w:tplc="04100019" w:tentative="1">
+      <w:start w:val="1"/>
+      <w:numFmt w:val="lowerLetter"/>
+      <w:lvlText w:val="%2."/>
+      <w:lvlJc w:val="left"/>
+      <w:pPr>
+        <w:ind w:left="1440" w:hanging="360"/>
+      </w:pPr>
+    </w:lvl>
+    <w:lvl w:ilvl="2" w:tplc="0410001B" w:tentative="1">
+      <w:start w:val="1"/>
+      <w:numFmt w:val="lowerRoman"/>
+      <w:lvlText w:val="%3."/>
+      <w:lvlJc w:val="right"/>
+      <w:pPr>
+        <w:ind w:left="2160" w:hanging="180"/>
+      </w:pPr>
+    </w:lvl>
+    <w:lvl w:ilvl="3" w:tplc="0410000F" w:tentative="1">
+      <w:start w:val="1"/>
+      <w:numFmt w:val="decimal"/>
+      <w:lvlText w:val="%4."/>
+      <w:lvlJc w:val="left"/>
+      <w:pPr>
+        <w:ind w:left="2880" w:hanging="360"/>
+      </w:pPr>
+    </w:lvl>
+    <w:lvl w:ilvl="4" w:tplc="04100019" w:tentative="1">
+      <w:start w:val="1"/>
+      <w:numFmt w:val="lowerLetter"/>
+      <w:lvlText w:val="%5."/>
+      <w:lvlJc w:val="left"/>
+      <w:pPr>
+        <w:ind w:left="3600" w:hanging="360"/>
+      </w:pPr>
+    </w:lvl>
+    <w:lvl w:ilvl="5" w:tplc="0410001B" w:tentative="1">
+      <w:start w:val="1"/>
+      <w:numFmt w:val="lowerRoman"/>
+      <w:lvlText w:val="%6."/>
+      <w:lvlJc w:val="right"/>
+      <w:pPr>
+        <w:ind w:left="4320" w:hanging="180"/>
+      </w:pPr>
+    </w:lvl>
+    <w:lvl w:ilvl="6" w:tplc="0410000F" w:tentative="1">
+      <w:start w:val="1"/>
+      <w:numFmt w:val="decimal"/>
+      <w:lvlText w:val="%7."/>
+      <w:lvlJc w:val="left"/>
+      <w:pPr>
+        <w:ind w:left="5040" w:hanging="360"/>
+      </w:pPr>
+    </w:lvl>
+    <w:lvl w:ilvl="7" w:tplc="04100019" w:tentative="1">
+      <w:start w:val="1"/>
+      <w:numFmt w:val="lowerLetter"/>
+      <w:lvlText w:val="%8."/>
+      <w:lvlJc w:val="left"/>
+      <w:pPr>
+        <w:ind w:left="5760" w:hanging="360"/>
+      </w:pPr>
+    </w:lvl>
+    <w:lvl w:ilvl="8" w:tplc="0410001B" w:tentative="1">
+      <w:start w:val="1"/>
+      <w:numFmt w:val="lowerRoman"/>
+      <w:lvlText w:val="%9."/>
+      <w:lvlJc w:val="right"/>
+      <w:pPr>
+        <w:ind w:left="6480" w:hanging="180"/>
+      </w:pPr>
+    </w:lvl>
+  </w:abstractNum>
+  <w:abstractNum w:abstractNumId="2" w15:restartNumberingAfterBreak="0">
     <w:nsid w:val="6AAB00BF"/>
     <w:multiLevelType w:val="multilevel"/>
     <w:tmpl w:val="B908DE30"/>
@@ -659,16 +2315,19 @@
     </w:lvl>
   </w:abstractNum>
   <w:num w:numId="1" w16cid:durableId="778259100">
-    <w:abstractNumId w:val="1"/>
+    <w:abstractNumId w:val="2"/>
   </w:num>
   <w:num w:numId="2" w16cid:durableId="1640917827">
     <w:abstractNumId w:val="0"/>
+  </w:num>
+  <w:num w:numId="3" w16cid:durableId="1616014178">
+    <w:abstractNumId w:val="1"/>
   </w:num>
 </w:numbering>
 </file>
 
 <file path=word/styles.xml><?xml version="1.0" encoding="utf-8"?>
-<w:styles xmlns:mc="http://schemas.openxmlformats.org/markup-compatibility/2006" xmlns:r="http://schemas.openxmlformats.org/officeDocument/2006/relationships" xmlns:w="http://schemas.openxmlformats.org/wordprocessingml/2006/main" xmlns:w14="http://schemas.microsoft.com/office/word/2010/wordml" xmlns:w15="http://schemas.microsoft.com/office/word/2012/wordml" xmlns:w16cex="http://schemas.microsoft.com/office/word/2018/wordml/cex" xmlns:w16cid="http://schemas.microsoft.com/office/word/2016/wordml/cid" xmlns:w16="http://schemas.microsoft.com/office/word/2018/wordml" xmlns:w16sdtdh="http://schemas.microsoft.com/office/word/2020/wordml/sdtdatahash" xmlns:w16se="http://schemas.microsoft.com/office/word/2015/wordml/symex" mc:Ignorable="w14 w15 w16se w16cid w16 w16cex w16sdtdh">
+<w:styles xmlns:mc="http://schemas.openxmlformats.org/markup-compatibility/2006" xmlns:r="http://schemas.openxmlformats.org/officeDocument/2006/relationships" xmlns:w="http://schemas.openxmlformats.org/wordprocessingml/2006/main" xmlns:w14="http://schemas.microsoft.com/office/word/2010/wordml" xmlns:w15="http://schemas.microsoft.com/office/word/2012/wordml" xmlns:w16cex="http://schemas.microsoft.com/office/word/2018/wordml/cex" xmlns:w16cid="http://schemas.microsoft.com/office/word/2016/wordml/cid" xmlns:w16="http://schemas.microsoft.com/office/word/2018/wordml" xmlns:w16du="http://schemas.microsoft.com/office/word/2023/wordml/word16du" xmlns:w16sdtdh="http://schemas.microsoft.com/office/word/2020/wordml/sdtdatahash" xmlns:w16sdtfl="http://schemas.microsoft.com/office/word/2024/wordml/sdtformatlock" xmlns:w16se="http://schemas.microsoft.com/office/word/2015/wordml/symex" mc:Ignorable="w14 w15 w16se w16cid w16 w16cex w16sdtdh w16sdtfl w16du">
   <w:docDefaults>
     <w:rPrDefault>
       <w:rPr>
@@ -1064,15 +2723,16 @@
     <w:lsdException w:name="Unresolved Mention" w:semiHidden="1" w:unhideWhenUsed="1"/>
     <w:lsdException w:name="Smart Link" w:semiHidden="1" w:unhideWhenUsed="1"/>
   </w:latentStyles>
-  <w:style w:type="paragraph" w:default="1" w:styleId="Normal">
+  <w:style w:type="paragraph" w:default="1" w:styleId="Normale">
     <w:name w:val="Normal"/>
     <w:qFormat/>
+    <w:rsid w:val="00C82503"/>
   </w:style>
-  <w:style w:type="paragraph" w:styleId="Heading1">
+  <w:style w:type="paragraph" w:styleId="Titolo1">
     <w:name w:val="heading 1"/>
-    <w:basedOn w:val="Normal"/>
-    <w:next w:val="Normal"/>
-    <w:link w:val="Heading1Char"/>
+    <w:basedOn w:val="Normale"/>
+    <w:next w:val="Normale"/>
+    <w:link w:val="Titolo1Carattere"/>
     <w:uiPriority w:val="9"/>
     <w:qFormat/>
     <w:rsid w:val="00190C3F"/>
@@ -1089,11 +2749,11 @@
       <w:szCs w:val="40"/>
     </w:rPr>
   </w:style>
-  <w:style w:type="paragraph" w:styleId="Heading2">
+  <w:style w:type="paragraph" w:styleId="Titolo2">
     <w:name w:val="heading 2"/>
-    <w:basedOn w:val="Normal"/>
-    <w:next w:val="Normal"/>
-    <w:link w:val="Heading2Char"/>
+    <w:basedOn w:val="Normale"/>
+    <w:next w:val="Normale"/>
+    <w:link w:val="Titolo2Carattere"/>
     <w:uiPriority w:val="9"/>
     <w:unhideWhenUsed/>
     <w:qFormat/>
@@ -1110,13 +2770,12 @@
       <w:szCs w:val="32"/>
     </w:rPr>
   </w:style>
-  <w:style w:type="paragraph" w:styleId="Heading3">
+  <w:style w:type="paragraph" w:styleId="Titolo3">
     <w:name w:val="heading 3"/>
-    <w:basedOn w:val="Normal"/>
-    <w:next w:val="Normal"/>
-    <w:link w:val="Heading3Char"/>
+    <w:basedOn w:val="Normale"/>
+    <w:next w:val="Normale"/>
+    <w:link w:val="Titolo3Carattere"/>
     <w:uiPriority w:val="9"/>
-    <w:semiHidden/>
     <w:unhideWhenUsed/>
     <w:qFormat/>
     <w:rsid w:val="00190C3F"/>
@@ -1133,13 +2792,12 @@
       <w:szCs w:val="28"/>
     </w:rPr>
   </w:style>
-  <w:style w:type="paragraph" w:styleId="Heading4">
+  <w:style w:type="paragraph" w:styleId="Titolo4">
     <w:name w:val="heading 4"/>
-    <w:basedOn w:val="Normal"/>
-    <w:next w:val="Normal"/>
-    <w:link w:val="Heading4Char"/>
+    <w:basedOn w:val="Normale"/>
+    <w:next w:val="Normale"/>
+    <w:link w:val="Titolo4Carattere"/>
     <w:uiPriority w:val="9"/>
-    <w:semiHidden/>
     <w:unhideWhenUsed/>
     <w:qFormat/>
     <w:rsid w:val="00190C3F"/>
@@ -1156,11 +2814,11 @@
       <w:color w:val="0F4761" w:themeColor="accent1" w:themeShade="BF"/>
     </w:rPr>
   </w:style>
-  <w:style w:type="paragraph" w:styleId="Heading5">
+  <w:style w:type="paragraph" w:styleId="Titolo5">
     <w:name w:val="heading 5"/>
-    <w:basedOn w:val="Normal"/>
-    <w:next w:val="Normal"/>
-    <w:link w:val="Heading5Char"/>
+    <w:basedOn w:val="Normale"/>
+    <w:next w:val="Normale"/>
+    <w:link w:val="Titolo5Carattere"/>
     <w:uiPriority w:val="9"/>
     <w:semiHidden/>
     <w:unhideWhenUsed/>
@@ -1177,11 +2835,11 @@
       <w:color w:val="0F4761" w:themeColor="accent1" w:themeShade="BF"/>
     </w:rPr>
   </w:style>
-  <w:style w:type="paragraph" w:styleId="Heading6">
+  <w:style w:type="paragraph" w:styleId="Titolo6">
     <w:name w:val="heading 6"/>
-    <w:basedOn w:val="Normal"/>
-    <w:next w:val="Normal"/>
-    <w:link w:val="Heading6Char"/>
+    <w:basedOn w:val="Normale"/>
+    <w:next w:val="Normale"/>
+    <w:link w:val="Titolo6Carattere"/>
     <w:uiPriority w:val="9"/>
     <w:semiHidden/>
     <w:unhideWhenUsed/>
@@ -1200,11 +2858,11 @@
       <w:color w:val="595959" w:themeColor="text1" w:themeTint="A6"/>
     </w:rPr>
   </w:style>
-  <w:style w:type="paragraph" w:styleId="Heading7">
+  <w:style w:type="paragraph" w:styleId="Titolo7">
     <w:name w:val="heading 7"/>
-    <w:basedOn w:val="Normal"/>
-    <w:next w:val="Normal"/>
-    <w:link w:val="Heading7Char"/>
+    <w:basedOn w:val="Normale"/>
+    <w:next w:val="Normale"/>
+    <w:link w:val="Titolo7Carattere"/>
     <w:uiPriority w:val="9"/>
     <w:semiHidden/>
     <w:unhideWhenUsed/>
@@ -1221,11 +2879,11 @@
       <w:color w:val="595959" w:themeColor="text1" w:themeTint="A6"/>
     </w:rPr>
   </w:style>
-  <w:style w:type="paragraph" w:styleId="Heading8">
+  <w:style w:type="paragraph" w:styleId="Titolo8">
     <w:name w:val="heading 8"/>
-    <w:basedOn w:val="Normal"/>
-    <w:next w:val="Normal"/>
-    <w:link w:val="Heading8Char"/>
+    <w:basedOn w:val="Normale"/>
+    <w:next w:val="Normale"/>
+    <w:link w:val="Titolo8Carattere"/>
     <w:uiPriority w:val="9"/>
     <w:semiHidden/>
     <w:unhideWhenUsed/>
@@ -1244,11 +2902,11 @@
       <w:color w:val="272727" w:themeColor="text1" w:themeTint="D8"/>
     </w:rPr>
   </w:style>
-  <w:style w:type="paragraph" w:styleId="Heading9">
+  <w:style w:type="paragraph" w:styleId="Titolo9">
     <w:name w:val="heading 9"/>
-    <w:basedOn w:val="Normal"/>
-    <w:next w:val="Normal"/>
-    <w:link w:val="Heading9Char"/>
+    <w:basedOn w:val="Normale"/>
+    <w:next w:val="Normale"/>
+    <w:link w:val="Titolo9Carattere"/>
     <w:uiPriority w:val="9"/>
     <w:semiHidden/>
     <w:unhideWhenUsed/>
@@ -1265,13 +2923,13 @@
       <w:color w:val="272727" w:themeColor="text1" w:themeTint="D8"/>
     </w:rPr>
   </w:style>
-  <w:style w:type="character" w:default="1" w:styleId="DefaultParagraphFont">
+  <w:style w:type="character" w:default="1" w:styleId="Carpredefinitoparagrafo">
     <w:name w:val="Default Paragraph Font"/>
     <w:uiPriority w:val="1"/>
     <w:semiHidden/>
     <w:unhideWhenUsed/>
   </w:style>
-  <w:style w:type="table" w:default="1" w:styleId="TableNormal">
+  <w:style w:type="table" w:default="1" w:styleId="Tabellanormale">
     <w:name w:val="Normal Table"/>
     <w:uiPriority w:val="99"/>
     <w:semiHidden/>
@@ -1286,16 +2944,16 @@
       </w:tblCellMar>
     </w:tblPr>
   </w:style>
-  <w:style w:type="numbering" w:default="1" w:styleId="NoList">
+  <w:style w:type="numbering" w:default="1" w:styleId="Nessunelenco">
     <w:name w:val="No List"/>
     <w:uiPriority w:val="99"/>
     <w:semiHidden/>
     <w:unhideWhenUsed/>
   </w:style>
-  <w:style w:type="character" w:customStyle="1" w:styleId="Heading1Char">
-    <w:name w:val="Heading 1 Char"/>
-    <w:basedOn w:val="DefaultParagraphFont"/>
-    <w:link w:val="Heading1"/>
+  <w:style w:type="character" w:customStyle="1" w:styleId="Titolo1Carattere">
+    <w:name w:val="Titolo 1 Carattere"/>
+    <w:basedOn w:val="Carpredefinitoparagrafo"/>
+    <w:link w:val="Titolo1"/>
     <w:uiPriority w:val="9"/>
     <w:rsid w:val="00190C3F"/>
     <w:rPr>
@@ -1305,10 +2963,10 @@
       <w:szCs w:val="40"/>
     </w:rPr>
   </w:style>
-  <w:style w:type="character" w:customStyle="1" w:styleId="Heading2Char">
-    <w:name w:val="Heading 2 Char"/>
-    <w:basedOn w:val="DefaultParagraphFont"/>
-    <w:link w:val="Heading2"/>
+  <w:style w:type="character" w:customStyle="1" w:styleId="Titolo2Carattere">
+    <w:name w:val="Titolo 2 Carattere"/>
+    <w:basedOn w:val="Carpredefinitoparagrafo"/>
+    <w:link w:val="Titolo2"/>
     <w:uiPriority w:val="9"/>
     <w:rsid w:val="003A1D5E"/>
     <w:rPr>
@@ -1317,12 +2975,11 @@
       <w:szCs w:val="32"/>
     </w:rPr>
   </w:style>
-  <w:style w:type="character" w:customStyle="1" w:styleId="Heading3Char">
-    <w:name w:val="Heading 3 Char"/>
-    <w:basedOn w:val="DefaultParagraphFont"/>
-    <w:link w:val="Heading3"/>
+  <w:style w:type="character" w:customStyle="1" w:styleId="Titolo3Carattere">
+    <w:name w:val="Titolo 3 Carattere"/>
+    <w:basedOn w:val="Carpredefinitoparagrafo"/>
+    <w:link w:val="Titolo3"/>
     <w:uiPriority w:val="9"/>
-    <w:semiHidden/>
     <w:rsid w:val="00190C3F"/>
     <w:rPr>
       <w:rFonts w:eastAsiaTheme="majorEastAsia" w:cstheme="majorBidi"/>
@@ -1331,12 +2988,11 @@
       <w:szCs w:val="28"/>
     </w:rPr>
   </w:style>
-  <w:style w:type="character" w:customStyle="1" w:styleId="Heading4Char">
-    <w:name w:val="Heading 4 Char"/>
-    <w:basedOn w:val="DefaultParagraphFont"/>
-    <w:link w:val="Heading4"/>
+  <w:style w:type="character" w:customStyle="1" w:styleId="Titolo4Carattere">
+    <w:name w:val="Titolo 4 Carattere"/>
+    <w:basedOn w:val="Carpredefinitoparagrafo"/>
+    <w:link w:val="Titolo4"/>
     <w:uiPriority w:val="9"/>
-    <w:semiHidden/>
     <w:rsid w:val="00190C3F"/>
     <w:rPr>
       <w:rFonts w:eastAsiaTheme="majorEastAsia" w:cstheme="majorBidi"/>
@@ -1345,10 +3001,10 @@
       <w:color w:val="0F4761" w:themeColor="accent1" w:themeShade="BF"/>
     </w:rPr>
   </w:style>
-  <w:style w:type="character" w:customStyle="1" w:styleId="Heading5Char">
-    <w:name w:val="Heading 5 Char"/>
-    <w:basedOn w:val="DefaultParagraphFont"/>
-    <w:link w:val="Heading5"/>
+  <w:style w:type="character" w:customStyle="1" w:styleId="Titolo5Carattere">
+    <w:name w:val="Titolo 5 Carattere"/>
+    <w:basedOn w:val="Carpredefinitoparagrafo"/>
+    <w:link w:val="Titolo5"/>
     <w:uiPriority w:val="9"/>
     <w:semiHidden/>
     <w:rsid w:val="00190C3F"/>
@@ -1357,10 +3013,10 @@
       <w:color w:val="0F4761" w:themeColor="accent1" w:themeShade="BF"/>
     </w:rPr>
   </w:style>
-  <w:style w:type="character" w:customStyle="1" w:styleId="Heading6Char">
-    <w:name w:val="Heading 6 Char"/>
-    <w:basedOn w:val="DefaultParagraphFont"/>
-    <w:link w:val="Heading6"/>
+  <w:style w:type="character" w:customStyle="1" w:styleId="Titolo6Carattere">
+    <w:name w:val="Titolo 6 Carattere"/>
+    <w:basedOn w:val="Carpredefinitoparagrafo"/>
+    <w:link w:val="Titolo6"/>
     <w:uiPriority w:val="9"/>
     <w:semiHidden/>
     <w:rsid w:val="00190C3F"/>
@@ -1371,10 +3027,10 @@
       <w:color w:val="595959" w:themeColor="text1" w:themeTint="A6"/>
     </w:rPr>
   </w:style>
-  <w:style w:type="character" w:customStyle="1" w:styleId="Heading7Char">
-    <w:name w:val="Heading 7 Char"/>
-    <w:basedOn w:val="DefaultParagraphFont"/>
-    <w:link w:val="Heading7"/>
+  <w:style w:type="character" w:customStyle="1" w:styleId="Titolo7Carattere">
+    <w:name w:val="Titolo 7 Carattere"/>
+    <w:basedOn w:val="Carpredefinitoparagrafo"/>
+    <w:link w:val="Titolo7"/>
     <w:uiPriority w:val="9"/>
     <w:semiHidden/>
     <w:rsid w:val="00190C3F"/>
@@ -1383,10 +3039,10 @@
       <w:color w:val="595959" w:themeColor="text1" w:themeTint="A6"/>
     </w:rPr>
   </w:style>
-  <w:style w:type="character" w:customStyle="1" w:styleId="Heading8Char">
-    <w:name w:val="Heading 8 Char"/>
-    <w:basedOn w:val="DefaultParagraphFont"/>
-    <w:link w:val="Heading8"/>
+  <w:style w:type="character" w:customStyle="1" w:styleId="Titolo8Carattere">
+    <w:name w:val="Titolo 8 Carattere"/>
+    <w:basedOn w:val="Carpredefinitoparagrafo"/>
+    <w:link w:val="Titolo8"/>
     <w:uiPriority w:val="9"/>
     <w:semiHidden/>
     <w:rsid w:val="00190C3F"/>
@@ -1397,10 +3053,10 @@
       <w:color w:val="272727" w:themeColor="text1" w:themeTint="D8"/>
     </w:rPr>
   </w:style>
-  <w:style w:type="character" w:customStyle="1" w:styleId="Heading9Char">
-    <w:name w:val="Heading 9 Char"/>
-    <w:basedOn w:val="DefaultParagraphFont"/>
-    <w:link w:val="Heading9"/>
+  <w:style w:type="character" w:customStyle="1" w:styleId="Titolo9Carattere">
+    <w:name w:val="Titolo 9 Carattere"/>
+    <w:basedOn w:val="Carpredefinitoparagrafo"/>
+    <w:link w:val="Titolo9"/>
     <w:uiPriority w:val="9"/>
     <w:semiHidden/>
     <w:rsid w:val="00190C3F"/>
@@ -1409,11 +3065,11 @@
       <w:color w:val="272727" w:themeColor="text1" w:themeTint="D8"/>
     </w:rPr>
   </w:style>
-  <w:style w:type="paragraph" w:styleId="Title">
+  <w:style w:type="paragraph" w:styleId="Titolo">
     <w:name w:val="Title"/>
-    <w:basedOn w:val="Normal"/>
-    <w:next w:val="Normal"/>
-    <w:link w:val="TitleChar"/>
+    <w:basedOn w:val="Normale"/>
+    <w:next w:val="Normale"/>
+    <w:link w:val="TitoloCarattere"/>
     <w:uiPriority w:val="10"/>
     <w:qFormat/>
     <w:rsid w:val="00190C3F"/>
@@ -1429,10 +3085,10 @@
       <w:szCs w:val="56"/>
     </w:rPr>
   </w:style>
-  <w:style w:type="character" w:customStyle="1" w:styleId="TitleChar">
-    <w:name w:val="Title Char"/>
-    <w:basedOn w:val="DefaultParagraphFont"/>
-    <w:link w:val="Title"/>
+  <w:style w:type="character" w:customStyle="1" w:styleId="TitoloCarattere">
+    <w:name w:val="Titolo Carattere"/>
+    <w:basedOn w:val="Carpredefinitoparagrafo"/>
+    <w:link w:val="Titolo"/>
     <w:uiPriority w:val="10"/>
     <w:rsid w:val="00190C3F"/>
     <w:rPr>
@@ -1443,11 +3099,11 @@
       <w:szCs w:val="56"/>
     </w:rPr>
   </w:style>
-  <w:style w:type="paragraph" w:styleId="Subtitle">
+  <w:style w:type="paragraph" w:styleId="Sottotitolo">
     <w:name w:val="Subtitle"/>
-    <w:basedOn w:val="Normal"/>
-    <w:next w:val="Normal"/>
-    <w:link w:val="SubtitleChar"/>
+    <w:basedOn w:val="Normale"/>
+    <w:next w:val="Normale"/>
+    <w:link w:val="SottotitoloCarattere"/>
     <w:uiPriority w:val="11"/>
     <w:qFormat/>
     <w:rsid w:val="00190C3F"/>
@@ -1464,10 +3120,10 @@
       <w:szCs w:val="28"/>
     </w:rPr>
   </w:style>
-  <w:style w:type="character" w:customStyle="1" w:styleId="SubtitleChar">
-    <w:name w:val="Subtitle Char"/>
-    <w:basedOn w:val="DefaultParagraphFont"/>
-    <w:link w:val="Subtitle"/>
+  <w:style w:type="character" w:customStyle="1" w:styleId="SottotitoloCarattere">
+    <w:name w:val="Sottotitolo Carattere"/>
+    <w:basedOn w:val="Carpredefinitoparagrafo"/>
+    <w:link w:val="Sottotitolo"/>
     <w:uiPriority w:val="11"/>
     <w:rsid w:val="00190C3F"/>
     <w:rPr>
@@ -1478,11 +3134,11 @@
       <w:szCs w:val="28"/>
     </w:rPr>
   </w:style>
-  <w:style w:type="paragraph" w:styleId="Quote">
+  <w:style w:type="paragraph" w:styleId="Citazione">
     <w:name w:val="Quote"/>
-    <w:basedOn w:val="Normal"/>
-    <w:next w:val="Normal"/>
-    <w:link w:val="QuoteChar"/>
+    <w:basedOn w:val="Normale"/>
+    <w:next w:val="Normale"/>
+    <w:link w:val="CitazioneCarattere"/>
     <w:uiPriority w:val="29"/>
     <w:qFormat/>
     <w:rsid w:val="00190C3F"/>
@@ -1496,10 +3152,10 @@
       <w:color w:val="404040" w:themeColor="text1" w:themeTint="BF"/>
     </w:rPr>
   </w:style>
-  <w:style w:type="character" w:customStyle="1" w:styleId="QuoteChar">
-    <w:name w:val="Quote Char"/>
-    <w:basedOn w:val="DefaultParagraphFont"/>
-    <w:link w:val="Quote"/>
+  <w:style w:type="character" w:customStyle="1" w:styleId="CitazioneCarattere">
+    <w:name w:val="Citazione Carattere"/>
+    <w:basedOn w:val="Carpredefinitoparagrafo"/>
+    <w:link w:val="Citazione"/>
     <w:uiPriority w:val="29"/>
     <w:rsid w:val="00190C3F"/>
     <w:rPr>
@@ -1508,9 +3164,9 @@
       <w:color w:val="404040" w:themeColor="text1" w:themeTint="BF"/>
     </w:rPr>
   </w:style>
-  <w:style w:type="paragraph" w:styleId="ListParagraph">
+  <w:style w:type="paragraph" w:styleId="Paragrafoelenco">
     <w:name w:val="List Paragraph"/>
-    <w:basedOn w:val="Normal"/>
+    <w:basedOn w:val="Normale"/>
     <w:uiPriority w:val="34"/>
     <w:qFormat/>
     <w:rsid w:val="00190C3F"/>
@@ -1519,9 +3175,9 @@
       <w:contextualSpacing/>
     </w:pPr>
   </w:style>
-  <w:style w:type="character" w:styleId="IntenseEmphasis">
+  <w:style w:type="character" w:styleId="Enfasiintensa">
     <w:name w:val="Intense Emphasis"/>
-    <w:basedOn w:val="DefaultParagraphFont"/>
+    <w:basedOn w:val="Carpredefinitoparagrafo"/>
     <w:uiPriority w:val="21"/>
     <w:qFormat/>
     <w:rsid w:val="00190C3F"/>
@@ -1531,11 +3187,11 @@
       <w:color w:val="0F4761" w:themeColor="accent1" w:themeShade="BF"/>
     </w:rPr>
   </w:style>
-  <w:style w:type="paragraph" w:styleId="IntenseQuote">
+  <w:style w:type="paragraph" w:styleId="Citazioneintensa">
     <w:name w:val="Intense Quote"/>
-    <w:basedOn w:val="Normal"/>
-    <w:next w:val="Normal"/>
-    <w:link w:val="IntenseQuoteChar"/>
+    <w:basedOn w:val="Normale"/>
+    <w:next w:val="Normale"/>
+    <w:link w:val="CitazioneintensaCarattere"/>
     <w:uiPriority w:val="30"/>
     <w:qFormat/>
     <w:rsid w:val="00190C3F"/>
@@ -1554,10 +3210,10 @@
       <w:color w:val="0F4761" w:themeColor="accent1" w:themeShade="BF"/>
     </w:rPr>
   </w:style>
-  <w:style w:type="character" w:customStyle="1" w:styleId="IntenseQuoteChar">
-    <w:name w:val="Intense Quote Char"/>
-    <w:basedOn w:val="DefaultParagraphFont"/>
-    <w:link w:val="IntenseQuote"/>
+  <w:style w:type="character" w:customStyle="1" w:styleId="CitazioneintensaCarattere">
+    <w:name w:val="Citazione intensa Carattere"/>
+    <w:basedOn w:val="Carpredefinitoparagrafo"/>
+    <w:link w:val="Citazioneintensa"/>
     <w:uiPriority w:val="30"/>
     <w:rsid w:val="00190C3F"/>
     <w:rPr>
@@ -1566,9 +3222,9 @@
       <w:color w:val="0F4761" w:themeColor="accent1" w:themeShade="BF"/>
     </w:rPr>
   </w:style>
-  <w:style w:type="character" w:styleId="IntenseReference">
+  <w:style w:type="character" w:styleId="Riferimentointenso">
     <w:name w:val="Intense Reference"/>
-    <w:basedOn w:val="DefaultParagraphFont"/>
+    <w:basedOn w:val="Carpredefinitoparagrafo"/>
     <w:uiPriority w:val="32"/>
     <w:qFormat/>
     <w:rsid w:val="00190C3F"/>
@@ -1580,9 +3236,9 @@
       <w:spacing w:val="5"/>
     </w:rPr>
   </w:style>
-  <w:style w:type="paragraph" w:styleId="NormalWeb">
+  <w:style w:type="paragraph" w:styleId="NormaleWeb">
     <w:name w:val="Normal (Web)"/>
-    <w:basedOn w:val="Normal"/>
+    <w:basedOn w:val="Normale"/>
     <w:uiPriority w:val="99"/>
     <w:semiHidden/>
     <w:unhideWhenUsed/>
@@ -1597,15 +3253,26 @@
       <w14:ligatures w14:val="none"/>
     </w:rPr>
   </w:style>
-  <w:style w:type="character" w:styleId="Strong">
+  <w:style w:type="character" w:styleId="Enfasigrassetto">
     <w:name w:val="Strong"/>
-    <w:basedOn w:val="DefaultParagraphFont"/>
+    <w:basedOn w:val="Carpredefinitoparagrafo"/>
     <w:uiPriority w:val="22"/>
     <w:qFormat/>
     <w:rsid w:val="003A1D5E"/>
     <w:rPr>
       <w:b/>
       <w:bCs/>
+    </w:rPr>
+  </w:style>
+  <w:style w:type="character" w:styleId="Enfasicorsivo">
+    <w:name w:val="Emphasis"/>
+    <w:basedOn w:val="Carpredefinitoparagrafo"/>
+    <w:uiPriority w:val="20"/>
+    <w:qFormat/>
+    <w:rsid w:val="00A0685D"/>
+    <w:rPr>
+      <w:i/>
+      <w:iCs/>
     </w:rPr>
   </w:style>
 </w:styles>

</xml_diff>